<commit_message>
auto creating xray key and bring it back to test desc
</commit_message>
<xml_diff>
--- a/docs/QA/InterviewQASimple.docx
+++ b/docs/QA/InterviewQASimple.docx
@@ -112,7 +112,7 @@
           <w:kern w:val="0"/>
           <w14:ligatures w14:val="none"/>
         </w:rPr>
-        <w:t xml:space="preserve">Sprint planning is the first step of quality assurance. It starts with reviewing user stories, business rules, critical user workflows, and acceptance criteria to understand the </w:t>
+        <w:t xml:space="preserve">Sprint planning is the first step of quality assurance. It starts with reviewing user stories, business rules, critical user workflows, and acceptance criteria to understand the features and identify potential risks. Any unclear requirements are clarified with the team, testing effort is estimated, regression impact is assessed, and automation </w:t>
       </w:r>
       <w:r>
         <w:rPr>
@@ -120,7 +120,7 @@
           <w:kern w:val="0"/>
           <w14:ligatures w14:val="none"/>
         </w:rPr>
-        <w:t>features</w:t>
+        <w:t>or manu</w:t>
       </w:r>
       <w:r>
         <w:rPr>
@@ -128,7 +128,7 @@
           <w:kern w:val="0"/>
           <w14:ligatures w14:val="none"/>
         </w:rPr>
-        <w:t xml:space="preserve"> and identify potential risks. Any unclear requirements are clarified with the team, testing effort is estimated, regression impact is assessed, and automation </w:t>
+        <w:t>al</w:t>
       </w:r>
       <w:r>
         <w:rPr>
@@ -136,26 +136,15 @@
           <w:kern w:val="0"/>
           <w14:ligatures w14:val="none"/>
         </w:rPr>
-        <w:t xml:space="preserve">or </w:t>
-      </w:r>
-      <w:proofErr w:type="spellStart"/>
+        <w:t xml:space="preserve"> </w:t>
+      </w:r>
       <w:r>
         <w:rPr>
           <w:rFonts w:eastAsia="Times New Roman"/>
           <w:kern w:val="0"/>
           <w14:ligatures w14:val="none"/>
         </w:rPr>
-        <w:t>manu</w:t>
-      </w:r>
-      <w:proofErr w:type="spellEnd"/>
-      <w:r>
-        <w:rPr>
-          <w:rFonts w:eastAsia="Times New Roman"/>
-          <w:kern w:val="0"/>
-          <w:lang w:val="fr-FR"/>
-          <w14:ligatures w14:val="none"/>
-        </w:rPr>
-        <w:t xml:space="preserve"> </w:t>
+        <w:t>tests</w:t>
       </w:r>
       <w:r>
         <w:rPr>
@@ -163,14 +152,6 @@
           <w:kern w:val="0"/>
           <w14:ligatures w14:val="none"/>
         </w:rPr>
-        <w:t>tests</w:t>
-      </w:r>
-      <w:r>
-        <w:rPr>
-          <w:rFonts w:eastAsia="Times New Roman"/>
-          <w:kern w:val="0"/>
-          <w14:ligatures w14:val="none"/>
-        </w:rPr>
         <w:t xml:space="preserve"> are identified. The test environment, accounts, and test data are also verified before testing begins. Good planning helps reduce surprises later in the sprint and keeps the team on schedule.</w:t>
       </w:r>
     </w:p>
@@ -297,7 +278,37 @@
         <w:t>Answer:</w:t>
       </w:r>
       <w:r>
-        <w:t xml:space="preserve"> I've worked with Cypress, TypeScript, GitHub Actions, Jira, Xray, Artillery, OWASP ZAP, Selenium, Postman, Robot Framework, and Azure DevOps. More importantly, I understand the principles behind automation and select tools based on the application's technology stack, project requirements, and long-term maintainability. I believe learning a new tool is much easier than learning good automation practices.</w:t>
+        <w:t xml:space="preserve"> I've worked with Cypress, </w:t>
+      </w:r>
+      <w:r>
+        <w:t xml:space="preserve">Playwright, </w:t>
+      </w:r>
+      <w:r>
+        <w:t xml:space="preserve">Node JS, </w:t>
+      </w:r>
+      <w:r>
+        <w:t xml:space="preserve">TypeScript, </w:t>
+      </w:r>
+      <w:r>
+        <w:t xml:space="preserve">K6, </w:t>
+      </w:r>
+      <w:r>
+        <w:t xml:space="preserve">Artillery, OWASP ZAP, Selenium, Postman, Robot Framework, </w:t>
+      </w:r>
+      <w:r>
+        <w:t>Jira, Xray,</w:t>
+      </w:r>
+      <w:r>
+        <w:t xml:space="preserve"> </w:t>
+      </w:r>
+      <w:r>
+        <w:t>GitHub Actions</w:t>
+      </w:r>
+      <w:r>
+        <w:t xml:space="preserve"> </w:t>
+      </w:r>
+      <w:r>
+        <w:t>and Azure DevOps. More importantly, I understand the principles behind automation and select tools based on the application's technology stack, project requirements, and long-term maintainability. I believe learning a new tool is much easier than learning good automation practices.</w:t>
       </w:r>
     </w:p>
     <w:p>
@@ -390,13 +401,312 @@
       <w:r>
         <w:t xml:space="preserve"> Yes. I integrate automated tests into the CI/CD </w:t>
       </w:r>
+      <w:r>
+        <w:t>pipeline,</w:t>
+      </w:r>
+      <w:r>
+        <w:t xml:space="preserve"> so every code change is validated automatically. I use a fail-fast approach by running smoke tests first, followed by regression tests in parallel, and then performance and security testing if earlier stages pass. This provides fast feedback, reduces manual effort, and helps prevent defects from reaching production.</w:t>
+      </w:r>
+    </w:p>
+    <w:p>
+      <w:r>
+        <w:rPr>
+          <w:b/>
+          <w:bCs/>
+        </w:rPr>
+        <w:t>Reference:</w:t>
+      </w:r>
+      <w:r>
+        <w:t xml:space="preserve"> Example 3 – CI/CD Pipeline</w:t>
+      </w:r>
+    </w:p>
+    <w:p>
+      <w:r>
+        <w:rPr>
+          <w:b/>
+          <w:bCs/>
+        </w:rPr>
+        <w:t>Q7. What is your approach to test data management in automation?</w:t>
+      </w:r>
+    </w:p>
+    <w:p>
+      <w:r>
+        <w:rPr>
+          <w:b/>
+          <w:bCs/>
+        </w:rPr>
+        <w:t>What is the interviewer really asking?</w:t>
+      </w:r>
+      <w:r>
+        <w:t xml:space="preserve"> Can you build reliable tests that run independently without failing because of shared or inconsistent test data? They want to know whether you understand one of the biggest causes of unstable automation.</w:t>
+      </w:r>
+    </w:p>
+    <w:p>
+      <w:r>
+        <w:rPr>
+          <w:b/>
+          <w:bCs/>
+        </w:rPr>
+        <w:t>Answer:</w:t>
+      </w:r>
+      <w:r>
+        <w:t xml:space="preserve"> I make sure </w:t>
+      </w:r>
+    </w:p>
+    <w:p>
+      <w:pPr>
+        <w:pStyle w:val="ListParagraph"/>
+        <w:numPr>
+          <w:ilvl w:val="0"/>
+          <w:numId w:val="7"/>
+        </w:numPr>
+      </w:pPr>
+      <w:r>
+        <w:t xml:space="preserve">Reset the test data before each test. </w:t>
+      </w:r>
+    </w:p>
+    <w:p>
+      <w:pPr>
+        <w:pStyle w:val="ListParagraph"/>
+        <w:numPr>
+          <w:ilvl w:val="0"/>
+          <w:numId w:val="7"/>
+        </w:numPr>
+      </w:pPr>
+      <w:r>
+        <w:t xml:space="preserve">Centralize reusable test data. </w:t>
+      </w:r>
+    </w:p>
+    <w:p>
+      <w:pPr>
+        <w:pStyle w:val="ListParagraph"/>
+        <w:numPr>
+          <w:ilvl w:val="0"/>
+          <w:numId w:val="7"/>
+        </w:numPr>
+      </w:pPr>
+      <w:r>
+        <w:t>Generate unique test data when needed</w:t>
+      </w:r>
+      <w:r>
+        <w:t xml:space="preserve"> (like test email, password etc.)</w:t>
+      </w:r>
+      <w:r>
+        <w:t xml:space="preserve"> </w:t>
+      </w:r>
+    </w:p>
+    <w:p>
+      <w:pPr>
+        <w:pStyle w:val="ListParagraph"/>
+        <w:numPr>
+          <w:ilvl w:val="0"/>
+          <w:numId w:val="7"/>
+        </w:numPr>
+      </w:pPr>
+      <w:r>
+        <w:t xml:space="preserve">Keep each test independent for parallel execution. </w:t>
+      </w:r>
+    </w:p>
+    <w:p>
+      <w:pPr>
+        <w:pStyle w:val="ListParagraph"/>
+        <w:numPr>
+          <w:ilvl w:val="0"/>
+          <w:numId w:val="7"/>
+        </w:numPr>
+      </w:pPr>
+      <w:r>
+        <w:t xml:space="preserve">This makes </w:t>
+      </w:r>
+      <w:r>
+        <w:t>automation</w:t>
+      </w:r>
+      <w:r>
+        <w:t xml:space="preserve"> more reliable, maintainable, and scalable.</w:t>
+      </w:r>
+    </w:p>
+    <w:p>
+      <w:r>
+        <w:rPr>
+          <w:b/>
+          <w:bCs/>
+        </w:rPr>
+        <w:t>Reference:</w:t>
+      </w:r>
+      <w:r>
+        <w:t xml:space="preserve"> Example 4 – API Automation</w:t>
+      </w:r>
+    </w:p>
+    <w:p>
+      <w:r>
+        <w:rPr>
+          <w:b/>
+          <w:bCs/>
+        </w:rPr>
+        <w:t>Q8. Can you explain how you handled test failures in your automation suite?</w:t>
+      </w:r>
+    </w:p>
+    <w:p>
+      <w:r>
+        <w:rPr>
+          <w:b/>
+          <w:bCs/>
+        </w:rPr>
+        <w:t>What is the interviewer really asking?</w:t>
+      </w:r>
+      <w:r>
+        <w:t xml:space="preserve"> When a test fails, can you investigate logically and identify the root cause instead of guessing or hiding the problem with retries? They want to understand your troubleshooting process.</w:t>
+      </w:r>
+    </w:p>
+    <w:p>
+      <w:r>
+        <w:rPr>
+          <w:b/>
+          <w:bCs/>
+        </w:rPr>
+        <w:t>Answer:</w:t>
+      </w:r>
+      <w:r>
+        <w:t xml:space="preserve"> When a test fails, I first determine whether the issue is caused by the </w:t>
+      </w:r>
+    </w:p>
+    <w:p>
+      <w:pPr>
+        <w:pStyle w:val="ListParagraph"/>
+        <w:numPr>
+          <w:ilvl w:val="0"/>
+          <w:numId w:val="12"/>
+        </w:numPr>
+      </w:pPr>
+      <w:r>
+        <w:t>a</w:t>
+      </w:r>
+      <w:r>
+        <w:t>pplication</w:t>
+      </w:r>
+    </w:p>
+    <w:p>
+      <w:pPr>
+        <w:pStyle w:val="ListParagraph"/>
+        <w:numPr>
+          <w:ilvl w:val="0"/>
+          <w:numId w:val="12"/>
+        </w:numPr>
+      </w:pPr>
+      <w:r>
+        <w:t>the automation script</w:t>
+      </w:r>
+    </w:p>
+    <w:p>
+      <w:pPr>
+        <w:pStyle w:val="ListParagraph"/>
+        <w:numPr>
+          <w:ilvl w:val="0"/>
+          <w:numId w:val="12"/>
+        </w:numPr>
+      </w:pPr>
+      <w:r>
+        <w:t>the environment</w:t>
+      </w:r>
+    </w:p>
+    <w:p>
+      <w:pPr>
+        <w:pStyle w:val="ListParagraph"/>
+        <w:numPr>
+          <w:ilvl w:val="0"/>
+          <w:numId w:val="12"/>
+        </w:numPr>
+      </w:pPr>
+      <w:r>
+        <w:t xml:space="preserve">a flaky test. </w:t>
+      </w:r>
+    </w:p>
+    <w:p>
+      <w:r>
+        <w:t>I</w:t>
+      </w:r>
+      <w:r>
+        <w:t xml:space="preserve"> will </w:t>
+      </w:r>
+    </w:p>
+    <w:p>
+      <w:pPr>
+        <w:pStyle w:val="ListParagraph"/>
+        <w:numPr>
+          <w:ilvl w:val="0"/>
+          <w:numId w:val="16"/>
+        </w:numPr>
+      </w:pPr>
+      <w:r>
+        <w:t>c</w:t>
+      </w:r>
+      <w:r>
+        <w:t>ollect evidence such as screenshots, logs, network requests, and CI results.</w:t>
+      </w:r>
+    </w:p>
+    <w:p>
+      <w:pPr>
+        <w:pStyle w:val="ListParagraph"/>
+        <w:numPr>
+          <w:ilvl w:val="0"/>
+          <w:numId w:val="14"/>
+        </w:numPr>
+      </w:pPr>
+      <w:r>
+        <w:t>f</w:t>
+      </w:r>
+      <w:r>
+        <w:t>ocus on the root cause instead of adding retries or longer waits.</w:t>
+      </w:r>
+    </w:p>
+    <w:p>
+      <w:pPr>
+        <w:pStyle w:val="ListParagraph"/>
+        <w:numPr>
+          <w:ilvl w:val="0"/>
+          <w:numId w:val="14"/>
+        </w:numPr>
+      </w:pPr>
+      <w:r>
+        <w:t xml:space="preserve">fix the automation if it's a test </w:t>
+      </w:r>
+      <w:r>
+        <w:t xml:space="preserve">script </w:t>
+      </w:r>
+      <w:r>
+        <w:t>issue; otherwise, report the defect with clear evidence.</w:t>
+      </w:r>
+    </w:p>
+    <w:p>
+      <w:pPr>
+        <w:pStyle w:val="ListParagraph"/>
+        <w:numPr>
+          <w:ilvl w:val="0"/>
+          <w:numId w:val="14"/>
+        </w:numPr>
+      </w:pPr>
       <w:proofErr w:type="gramStart"/>
       <w:r>
-        <w:t>pipeline</w:t>
+        <w:lastRenderedPageBreak/>
+        <w:t>sometimes</w:t>
       </w:r>
       <w:proofErr w:type="gramEnd"/>
       <w:r>
-        <w:t xml:space="preserve"> so every code change is validated automatically. I use a fail-fast approach by running smoke tests first, followed by regression tests in parallel, and then performance and security testing if earlier stages pass. This provides fast feedback, reduces manual effort, and helps prevent defects from reaching production.</w:t>
+        <w:t xml:space="preserve"> even r</w:t>
+      </w:r>
+      <w:r>
+        <w:t xml:space="preserve">eproduce the issue and discuss it with the </w:t>
+      </w:r>
+      <w:r>
+        <w:t xml:space="preserve">developer </w:t>
+      </w:r>
+      <w:r>
+        <w:t>before creating a defect.</w:t>
+      </w:r>
+    </w:p>
+    <w:p>
+      <w:r>
+        <w:t>As previous full stack developer, I could read code and logic only as required.</w:t>
       </w:r>
     </w:p>
     <w:p>
@@ -408,6 +718,545 @@
         <w:t>Reference:</w:t>
       </w:r>
       <w:r>
+        <w:t xml:space="preserve"> Example 5 – Flaky Test Investigation, Example 3 – CI/CD Pipeline</w:t>
+      </w:r>
+    </w:p>
+    <w:p>
+      <w:r>
+        <w:rPr>
+          <w:b/>
+          <w:bCs/>
+        </w:rPr>
+        <w:t>Q9. What types of testing have you automated — UI, API, database, performance?</w:t>
+      </w:r>
+    </w:p>
+    <w:p>
+      <w:r>
+        <w:rPr>
+          <w:b/>
+          <w:bCs/>
+        </w:rPr>
+        <w:t>What is the interviewer really asking?</w:t>
+      </w:r>
+      <w:r>
+        <w:t xml:space="preserve"> How broad is your automation experience? They want to know whether you've worked beyond UI automation and understand how different testing types work together to improve software quality.</w:t>
+      </w:r>
+    </w:p>
+    <w:p>
+      <w:r>
+        <w:rPr>
+          <w:b/>
+          <w:bCs/>
+        </w:rPr>
+        <w:t>Answer:</w:t>
+      </w:r>
+      <w:r>
+        <w:t xml:space="preserve"> I've automated UI end-to-end testing, API testing, database validation, smoke testing, regression testing, performance testing, and security testing. Each testing type finds different categories of defects, so combining them provides better coverage and faster feedback than relying on UI automation alone.</w:t>
+      </w:r>
+    </w:p>
+    <w:p>
+      <w:r>
+        <w:rPr>
+          <w:b/>
+          <w:bCs/>
+        </w:rPr>
+        <w:t>Reference:</w:t>
+      </w:r>
+      <w:r>
+        <w:t xml:space="preserve"> Example 1 – Tank Limits Web Application, Example 3 – CI/CD Pipeline, Example 4 – API Automation</w:t>
+      </w:r>
+    </w:p>
+    <w:p>
+      <w:r>
+        <w:rPr>
+          <w:b/>
+          <w:bCs/>
+        </w:rPr>
+        <w:t>Q10. Can you describe your experience with API automation testing?</w:t>
+      </w:r>
+    </w:p>
+    <w:p>
+      <w:r>
+        <w:rPr>
+          <w:b/>
+          <w:bCs/>
+        </w:rPr>
+        <w:t>What is the interviewer really asking?</w:t>
+      </w:r>
+      <w:r>
+        <w:t xml:space="preserve"> Can you thoroughly validate APIs instead of only checking whether they return a successful status code? They want to know whether you understand authentication, validation, business rules, and backend verification.</w:t>
+      </w:r>
+    </w:p>
+    <w:p>
+      <w:r>
+        <w:rPr>
+          <w:b/>
+          <w:bCs/>
+        </w:rPr>
+        <w:t>Answer:</w:t>
+      </w:r>
+      <w:r>
+        <w:t xml:space="preserve"> I test REST APIs by validating request and response data, status codes, authentication, authorization, error handling, and business rules. For requests that modify data, I also verify the database to confirm the correct information was stored instead of relying only on the API response. API testing is fast, reliable, and allows me to validate business logic without depending on the user interface.</w:t>
+      </w:r>
+    </w:p>
+    <w:p>
+      <w:r>
+        <w:rPr>
+          <w:b/>
+          <w:bCs/>
+        </w:rPr>
+        <w:t>Reference:</w:t>
+      </w:r>
+      <w:r>
+        <w:t xml:space="preserve"> Example 4 – API Automation, Example 2 – SSO Authentication</w:t>
+      </w:r>
+    </w:p>
+    <w:p>
+      <w:r>
+        <w:rPr>
+          <w:b/>
+          <w:bCs/>
+        </w:rPr>
+        <w:t>Q11. Have you ever written custom utilities or wrappers for your automation framework?</w:t>
+      </w:r>
+    </w:p>
+    <w:p>
+      <w:r>
+        <w:rPr>
+          <w:b/>
+          <w:bCs/>
+        </w:rPr>
+        <w:t>What is the interviewer really asking?</w:t>
+      </w:r>
+      <w:r>
+        <w:t xml:space="preserve"> Can you design and maintain an automation framework instead of only writing individual test cases? They want to know whether you build reusable, maintainable solutions that make the entire team more productive.</w:t>
+      </w:r>
+    </w:p>
+    <w:p>
+      <w:r>
+        <w:rPr>
+          <w:b/>
+          <w:bCs/>
+        </w:rPr>
+        <w:t>Answer:</w:t>
+      </w:r>
+      <w:r>
+        <w:t xml:space="preserve"> Yes. I build reusable components such as custom commands, helper functions, shared test data, assertions, and utility methods to keep the test suite clean and maintainable. Instead of duplicating code across multiple tests, I centralize common </w:t>
+      </w:r>
+      <w:r>
+        <w:lastRenderedPageBreak/>
+        <w:t>functionality so updates only need to be made in one place. This improves readability, reduces maintenance, and makes the framework easier for the team to use.</w:t>
+      </w:r>
+    </w:p>
+    <w:p>
+      <w:pPr>
+        <w:pStyle w:val="ListParagraph"/>
+        <w:numPr>
+          <w:ilvl w:val="0"/>
+          <w:numId w:val="8"/>
+        </w:numPr>
+      </w:pPr>
+      <w:r>
+        <w:t xml:space="preserve">Validate requests and responses. </w:t>
+      </w:r>
+    </w:p>
+    <w:p>
+      <w:pPr>
+        <w:pStyle w:val="ListParagraph"/>
+        <w:numPr>
+          <w:ilvl w:val="0"/>
+          <w:numId w:val="8"/>
+        </w:numPr>
+      </w:pPr>
+      <w:r>
+        <w:t xml:space="preserve">Check status codes. </w:t>
+      </w:r>
+    </w:p>
+    <w:p>
+      <w:pPr>
+        <w:pStyle w:val="ListParagraph"/>
+        <w:numPr>
+          <w:ilvl w:val="0"/>
+          <w:numId w:val="8"/>
+        </w:numPr>
+      </w:pPr>
+      <w:r>
+        <w:t xml:space="preserve">Verify authentication and authorization. </w:t>
+      </w:r>
+    </w:p>
+    <w:p>
+      <w:pPr>
+        <w:pStyle w:val="ListParagraph"/>
+        <w:numPr>
+          <w:ilvl w:val="0"/>
+          <w:numId w:val="8"/>
+        </w:numPr>
+      </w:pPr>
+      <w:r>
+        <w:t xml:space="preserve">Test error handling and business rules. </w:t>
+      </w:r>
+    </w:p>
+    <w:p>
+      <w:pPr>
+        <w:pStyle w:val="ListParagraph"/>
+        <w:numPr>
+          <w:ilvl w:val="0"/>
+          <w:numId w:val="8"/>
+        </w:numPr>
+      </w:pPr>
+      <w:r>
+        <w:t xml:space="preserve">Verify database changes for </w:t>
+      </w:r>
+      <w:proofErr w:type="gramStart"/>
+      <w:r>
+        <w:t>create</w:t>
+      </w:r>
+      <w:proofErr w:type="gramEnd"/>
+      <w:r>
+        <w:t xml:space="preserve">, update, or </w:t>
+      </w:r>
+      <w:proofErr w:type="gramStart"/>
+      <w:r>
+        <w:t>delete</w:t>
+      </w:r>
+      <w:proofErr w:type="gramEnd"/>
+      <w:r>
+        <w:t xml:space="preserve"> requests. </w:t>
+      </w:r>
+    </w:p>
+    <w:p>
+      <w:pPr>
+        <w:pStyle w:val="ListParagraph"/>
+        <w:numPr>
+          <w:ilvl w:val="0"/>
+          <w:numId w:val="8"/>
+        </w:numPr>
+      </w:pPr>
+      <w:r>
+        <w:t>API tests are fast, reliable, and independent of the UI.</w:t>
+      </w:r>
+    </w:p>
+    <w:p>
+      <w:r>
+        <w:rPr>
+          <w:b/>
+          <w:bCs/>
+        </w:rPr>
+        <w:t>Reference:</w:t>
+      </w:r>
+      <w:r>
+        <w:t xml:space="preserve"> Example 1 – Tank Limits Web Application</w:t>
+      </w:r>
+    </w:p>
+    <w:p>
+      <w:r>
+        <w:rPr>
+          <w:b/>
+          <w:bCs/>
+        </w:rPr>
+        <w:t xml:space="preserve">Q12. When would you use an array versus an </w:t>
+      </w:r>
+      <w:proofErr w:type="spellStart"/>
+      <w:r>
+        <w:rPr>
+          <w:b/>
+          <w:bCs/>
+        </w:rPr>
+        <w:t>ArrayList</w:t>
+      </w:r>
+      <w:proofErr w:type="spellEnd"/>
+      <w:r>
+        <w:rPr>
+          <w:b/>
+          <w:bCs/>
+        </w:rPr>
+        <w:t>?</w:t>
+      </w:r>
+    </w:p>
+    <w:p>
+      <w:r>
+        <w:rPr>
+          <w:b/>
+          <w:bCs/>
+        </w:rPr>
+        <w:t>What is the interviewer really asking?</w:t>
+      </w:r>
+      <w:r>
+        <w:t xml:space="preserve"> Do you have solid programming fundamentals, and can you explain basic concepts clearly? They're evaluating your coding knowledge more than your testing experience.</w:t>
+      </w:r>
+    </w:p>
+    <w:p>
+      <w:r>
+        <w:rPr>
+          <w:b/>
+          <w:bCs/>
+        </w:rPr>
+        <w:t>Answer:</w:t>
+      </w:r>
+      <w:r>
+        <w:t xml:space="preserve"> The answer depends on the programming language. In Java or C#, an array has a fixed size and is generally faster, while an </w:t>
+      </w:r>
+      <w:proofErr w:type="spellStart"/>
+      <w:r>
+        <w:t>ArrayList</w:t>
+      </w:r>
+      <w:proofErr w:type="spellEnd"/>
+      <w:r>
+        <w:t xml:space="preserve"> is dynamic and easier to use when the number of elements can change. In TypeScript or JavaScript, arrays are already dynamic, so the discussion is usually about choosing between an Array, Set, or Map depending on whether you need ordering, uniqueness, or key-value lookups. The important point is choosing the right data structure for the problem.</w:t>
+      </w:r>
+    </w:p>
+    <w:p>
+      <w:r>
+        <w:rPr>
+          <w:b/>
+          <w:bCs/>
+        </w:rPr>
+        <w:t>Reference:</w:t>
+      </w:r>
+      <w:r>
+        <w:t xml:space="preserve"> No project example needed.</w:t>
+      </w:r>
+    </w:p>
+    <w:p>
+      <w:r>
+        <w:rPr>
+          <w:b/>
+          <w:bCs/>
+        </w:rPr>
+        <w:t>Q13. What is a test automation framework and what are its key components?</w:t>
+      </w:r>
+    </w:p>
+    <w:p>
+      <w:r>
+        <w:rPr>
+          <w:b/>
+          <w:bCs/>
+        </w:rPr>
+        <w:t>What is the interviewer really asking?</w:t>
+      </w:r>
+      <w:r>
+        <w:t xml:space="preserve"> Do you understand how a complete automation solution is organized instead of thinking automation is just writing test scripts? They want to know whether you can design a framework that is maintainable and scalable.</w:t>
+      </w:r>
+    </w:p>
+    <w:p>
+      <w:r>
+        <w:rPr>
+          <w:b/>
+          <w:bCs/>
+        </w:rPr>
+        <w:t>Answer:</w:t>
+      </w:r>
+      <w:r>
+        <w:t xml:space="preserve"> A test automation framework is a structured way to organize and execute automated tests consistently. It typically includes </w:t>
+      </w:r>
+    </w:p>
+    <w:p>
+      <w:pPr>
+        <w:pStyle w:val="ListParagraph"/>
+        <w:numPr>
+          <w:ilvl w:val="0"/>
+          <w:numId w:val="9"/>
+        </w:numPr>
+      </w:pPr>
+      <w:r>
+        <w:t>test runner</w:t>
+      </w:r>
+    </w:p>
+    <w:p>
+      <w:pPr>
+        <w:pStyle w:val="ListParagraph"/>
+        <w:numPr>
+          <w:ilvl w:val="0"/>
+          <w:numId w:val="9"/>
+        </w:numPr>
+      </w:pPr>
+      <w:r>
+        <w:t>reusable test scripts</w:t>
+      </w:r>
+    </w:p>
+    <w:p>
+      <w:pPr>
+        <w:pStyle w:val="ListParagraph"/>
+        <w:numPr>
+          <w:ilvl w:val="0"/>
+          <w:numId w:val="9"/>
+        </w:numPr>
+      </w:pPr>
+      <w:r>
+        <w:t>assertions</w:t>
+      </w:r>
+    </w:p>
+    <w:p>
+      <w:pPr>
+        <w:pStyle w:val="ListParagraph"/>
+        <w:numPr>
+          <w:ilvl w:val="0"/>
+          <w:numId w:val="9"/>
+        </w:numPr>
+      </w:pPr>
+      <w:r>
+        <w:t>test data management</w:t>
+      </w:r>
+    </w:p>
+    <w:p>
+      <w:pPr>
+        <w:pStyle w:val="ListParagraph"/>
+        <w:numPr>
+          <w:ilvl w:val="0"/>
+          <w:numId w:val="9"/>
+        </w:numPr>
+      </w:pPr>
+      <w:r>
+        <w:t>configuration</w:t>
+      </w:r>
+    </w:p>
+    <w:p>
+      <w:pPr>
+        <w:pStyle w:val="ListParagraph"/>
+        <w:numPr>
+          <w:ilvl w:val="0"/>
+          <w:numId w:val="9"/>
+        </w:numPr>
+      </w:pPr>
+      <w:r>
+        <w:t>reporting</w:t>
+      </w:r>
+      <w:r>
+        <w:t xml:space="preserve"> and log</w:t>
+      </w:r>
+    </w:p>
+    <w:p>
+      <w:pPr>
+        <w:pStyle w:val="ListParagraph"/>
+        <w:numPr>
+          <w:ilvl w:val="0"/>
+          <w:numId w:val="9"/>
+        </w:numPr>
+      </w:pPr>
+      <w:r>
+        <w:t xml:space="preserve">common </w:t>
+      </w:r>
+      <w:r>
+        <w:t>utilities</w:t>
+      </w:r>
+    </w:p>
+    <w:p>
+      <w:pPr>
+        <w:pStyle w:val="ListParagraph"/>
+        <w:numPr>
+          <w:ilvl w:val="0"/>
+          <w:numId w:val="9"/>
+        </w:numPr>
+      </w:pPr>
+      <w:r>
+        <w:lastRenderedPageBreak/>
+        <w:t>CI/CD integration</w:t>
+      </w:r>
+    </w:p>
+    <w:p>
+      <w:r>
+        <w:t>A good framework makes tests easier to maintain, encourages code reuse, and allows the team to scale automation as the application grows.</w:t>
+      </w:r>
+    </w:p>
+    <w:p>
+      <w:r>
+        <w:rPr>
+          <w:b/>
+          <w:bCs/>
+        </w:rPr>
+        <w:t>Reference:</w:t>
+      </w:r>
+      <w:r>
+        <w:t xml:space="preserve"> Example 1 – Tank Limits Web Application, Example 3 – CI/CD Pipeline</w:t>
+      </w:r>
+    </w:p>
+    <w:p>
+      <w:r>
+        <w:rPr>
+          <w:b/>
+          <w:bCs/>
+        </w:rPr>
+        <w:t>Q14. What is black-box testing and white-box testing, and when would you use each?</w:t>
+      </w:r>
+    </w:p>
+    <w:p>
+      <w:r>
+        <w:rPr>
+          <w:b/>
+          <w:bCs/>
+        </w:rPr>
+        <w:t>What is the interviewer really asking?</w:t>
+      </w:r>
+      <w:r>
+        <w:t xml:space="preserve"> Can you think like both a QA engineer and a developer? They want to know whether you understand testing from both the user's perspective and the application's internal logic.</w:t>
+      </w:r>
+    </w:p>
+    <w:p>
+      <w:r>
+        <w:rPr>
+          <w:b/>
+          <w:bCs/>
+        </w:rPr>
+        <w:t>Answer:</w:t>
+      </w:r>
+      <w:r>
+        <w:t xml:space="preserve"> Black-box testing verifies the application's behavior without considering how the code is implemented, making it ideal for UI, API, and end-to-end testing. White-box testing focuses on the internal code, logic, and execution paths, making it more suitable for unit testing and code coverage. While most QA automation is black-box testing, being able to read code helps me design better test cases, identify edge cases, and troubleshoot failures more efficiently.</w:t>
+      </w:r>
+    </w:p>
+    <w:p>
+      <w:r>
+        <w:rPr>
+          <w:b/>
+          <w:bCs/>
+        </w:rPr>
+        <w:t>Reference:</w:t>
+      </w:r>
+      <w:r>
+        <w:t xml:space="preserve"> Example 4 – API Automation</w:t>
+      </w:r>
+    </w:p>
+    <w:p>
+      <w:r>
+        <w:rPr>
+          <w:b/>
+          <w:bCs/>
+        </w:rPr>
+        <w:t>Q15. We have an application that needs to handle 75,000 concurrent requests. How would you test it?</w:t>
+      </w:r>
+    </w:p>
+    <w:p>
+      <w:r>
+        <w:rPr>
+          <w:b/>
+          <w:bCs/>
+        </w:rPr>
+        <w:t>What is the interviewer really asking?</w:t>
+      </w:r>
+      <w:r>
+        <w:t xml:space="preserve"> Can you design a performance testing strategy instead of simply running a load testing tool? They want to know whether you understand scalability, system limits, monitoring, and performance goals.</w:t>
+      </w:r>
+    </w:p>
+    <w:p>
+      <w:r>
+        <w:rPr>
+          <w:b/>
+          <w:bCs/>
+        </w:rPr>
+        <w:t>Answer:</w:t>
+      </w:r>
+      <w:r>
+        <w:t xml:space="preserve"> I would first define the performance objectives, such as response time, throughput, and acceptable error rate. Then I'd perform load testing to verify the application can handle the expected traffic while monitoring CPU, memory, database connections, and system resources. If it meets the target, I'd continue with stress, spike, and endurance testing to understand the application's limits, recovery behavior, and long-term stability. Performance testing isn't just about generating traffic—it's about understanding how the entire system behaves under different conditions.</w:t>
+      </w:r>
+    </w:p>
+    <w:p>
+      <w:r>
+        <w:rPr>
+          <w:b/>
+          <w:bCs/>
+        </w:rPr>
+        <w:t>Reference:</w:t>
+      </w:r>
+      <w:r>
         <w:t xml:space="preserve"> Example 3 – CI/CD Pipeline</w:t>
       </w:r>
     </w:p>
@@ -417,7 +1266,7 @@
           <w:b/>
           <w:bCs/>
         </w:rPr>
-        <w:t>Q7. What is your approach to test data management in automation?</w:t>
+        <w:t>Q16. What percentage of an application needs to be tested with automation?</w:t>
       </w:r>
     </w:p>
     <w:p>
@@ -429,19 +1278,114 @@
         <w:t>What is the interviewer really asking?</w:t>
       </w:r>
       <w:r>
-        <w:t xml:space="preserve"> Can you build reliable tests that run independently without failing because of shared or inconsistent test data? They want to know whether you understand one of the biggest causes of unstable automation.</w:t>
-      </w:r>
-    </w:p>
-    <w:p>
-      <w:r>
-        <w:rPr>
-          <w:b/>
-          <w:bCs/>
-        </w:rPr>
+        <w:t xml:space="preserve"> Do you understand the business value of automation instead of chasing 100% automation? They want to know whether you can balance automation coverage, maintenance cost, and return on investment.</w:t>
+      </w:r>
+    </w:p>
+    <w:p>
+      <w:r>
+        <w:rPr>
+          <w:b/>
+          <w:bCs/>
+        </w:rPr>
+        <w:lastRenderedPageBreak/>
         <w:t>Answer:</w:t>
       </w:r>
       <w:r>
-        <w:t xml:space="preserve"> I make sure every test starts from a known state by resetting the test data before execution. I avoid hardcoded values, generate unique data when necessary, and use dedicated test environments instead of production data. Keeping each test independent makes the automation more reliable, easier to maintain, and suitable for parallel execution.</w:t>
+        <w:t xml:space="preserve"> </w:t>
+      </w:r>
+    </w:p>
+    <w:p>
+      <w:pPr>
+        <w:pStyle w:val="ListParagraph"/>
+        <w:numPr>
+          <w:ilvl w:val="0"/>
+          <w:numId w:val="10"/>
+        </w:numPr>
+      </w:pPr>
+      <w:r>
+        <w:t>There isn't a fixed percentage.</w:t>
+      </w:r>
+    </w:p>
+    <w:p>
+      <w:pPr>
+        <w:pStyle w:val="ListParagraph"/>
+        <w:numPr>
+          <w:ilvl w:val="0"/>
+          <w:numId w:val="10"/>
+        </w:numPr>
+      </w:pPr>
+      <w:r>
+        <w:t>It depends on the application, business risk, and ROI.</w:t>
+      </w:r>
+    </w:p>
+    <w:p>
+      <w:pPr>
+        <w:pStyle w:val="ListParagraph"/>
+        <w:numPr>
+          <w:ilvl w:val="0"/>
+          <w:numId w:val="10"/>
+        </w:numPr>
+      </w:pPr>
+      <w:r>
+        <w:t xml:space="preserve">Automate </w:t>
+      </w:r>
+      <w:r>
+        <w:t xml:space="preserve">test applies to </w:t>
+      </w:r>
+      <w:r>
+        <w:t xml:space="preserve">stable, </w:t>
+      </w:r>
+      <w:r>
+        <w:t xml:space="preserve">repeat, </w:t>
+      </w:r>
+      <w:r>
+        <w:t>high-value regression tests.</w:t>
+      </w:r>
+    </w:p>
+    <w:p>
+      <w:pPr>
+        <w:pStyle w:val="ListParagraph"/>
+        <w:numPr>
+          <w:ilvl w:val="0"/>
+          <w:numId w:val="10"/>
+        </w:numPr>
+      </w:pPr>
+      <w:r>
+        <w:t>manual</w:t>
+      </w:r>
+      <w:r>
+        <w:t xml:space="preserve"> test applies to human interactive, </w:t>
+      </w:r>
+      <w:r>
+        <w:t xml:space="preserve">frequently changing features </w:t>
+      </w:r>
+      <w:r>
+        <w:t>and one time test</w:t>
+      </w:r>
+      <w:r>
+        <w:t>.</w:t>
+      </w:r>
+    </w:p>
+    <w:p>
+      <w:r>
+        <w:t xml:space="preserve">The goal is not </w:t>
+      </w:r>
+      <w:r>
+        <w:t>to achieve</w:t>
+      </w:r>
+      <w:r>
+        <w:t xml:space="preserve"> 100% automation</w:t>
+      </w:r>
+      <w:r>
+        <w:t xml:space="preserve"> instead of </w:t>
+      </w:r>
+      <w:proofErr w:type="gramStart"/>
+      <w:r>
+        <w:t>maximize</w:t>
+      </w:r>
+      <w:proofErr w:type="gramEnd"/>
+      <w:r>
+        <w:t xml:space="preserve"> business value.</w:t>
       </w:r>
     </w:p>
     <w:p>
@@ -453,16 +1397,16 @@
         <w:t>Reference:</w:t>
       </w:r>
       <w:r>
-        <w:t xml:space="preserve"> Example 4 – API Automation</w:t>
-      </w:r>
-    </w:p>
-    <w:p>
-      <w:r>
-        <w:rPr>
-          <w:b/>
-          <w:bCs/>
-        </w:rPr>
-        <w:t>Q8. Can you explain how you handled test failures in your automation suite?</w:t>
+        <w:t xml:space="preserve"> Example 1 – Tank Limits Web Application, Example 2 – SSO Authentication</w:t>
+      </w:r>
+    </w:p>
+    <w:p>
+      <w:r>
+        <w:rPr>
+          <w:b/>
+          <w:bCs/>
+        </w:rPr>
+        <w:t>Q17. Describe a project and what role you played as a QA.</w:t>
       </w:r>
     </w:p>
     <w:p>
@@ -474,7 +1418,7 @@
         <w:t>What is the interviewer really asking?</w:t>
       </w:r>
       <w:r>
-        <w:t xml:space="preserve"> When a test fails, can you investigate logically and identify the root cause instead of guessing or hiding the problem with retries? They want to understand your troubleshooting process.</w:t>
+        <w:t xml:space="preserve"> Can you clearly explain your experience, your responsibilities, the technologies you used, and the impact you made? They want to understand what you personally contributed, not what the team accomplished.</w:t>
       </w:r>
     </w:p>
     <w:p>
@@ -486,15 +1430,7 @@
         <w:t>Answer:</w:t>
       </w:r>
       <w:r>
-        <w:t xml:space="preserve"> When a test fails, I first determine whether the issue is caused by the application, the automation script, the environment, or a flaky test. I collect evidence such as screenshots, logs, network requests, and CI results before deciding on the fix. Rather than adding retries or longer waits, I focus on finding and fixing the root </w:t>
-      </w:r>
-      <w:proofErr w:type="gramStart"/>
-      <w:r>
-        <w:t>cause</w:t>
-      </w:r>
-      <w:proofErr w:type="gramEnd"/>
-      <w:r>
-        <w:t xml:space="preserve"> so the automation remains stable and trustworthy.</w:t>
+        <w:t xml:space="preserve"> I start by explaining what the application does, then describe my responsibilities, the tools I used, and the results I achieved. I focus on my own contributions, such as designing the automation framework, creating automated tests, integrating CI/CD, improving test coverage, investigating defects, and helping the team deliver reliable releases. I always finish with measurable business value whenever possible.</w:t>
       </w:r>
     </w:p>
     <w:p>
@@ -506,16 +1442,16 @@
         <w:t>Reference:</w:t>
       </w:r>
       <w:r>
-        <w:t xml:space="preserve"> Example 5 – Flaky Test Investigation, Example 3 – CI/CD Pipeline</w:t>
-      </w:r>
-    </w:p>
-    <w:p>
-      <w:r>
-        <w:rPr>
-          <w:b/>
-          <w:bCs/>
-        </w:rPr>
-        <w:t>Q9. What types of testing have you automated — UI, API, database, performance?</w:t>
+        <w:t xml:space="preserve"> Example 1 – Tank Limits Web Application</w:t>
+      </w:r>
+    </w:p>
+    <w:p>
+      <w:r>
+        <w:rPr>
+          <w:b/>
+          <w:bCs/>
+        </w:rPr>
+        <w:t>Q18. What would you focus on during testing any project?</w:t>
       </w:r>
     </w:p>
     <w:p>
@@ -527,7 +1463,7 @@
         <w:t>What is the interviewer really asking?</w:t>
       </w:r>
       <w:r>
-        <w:t xml:space="preserve"> How broad is your automation experience? They want to know whether you've worked beyond UI automation and understand how different testing types work together to improve software quality.</w:t>
+        <w:t xml:space="preserve"> Can you prioritize testing based on business risk instead of trying to test everything equally? They want to know how you decide what deserves the most attention.</w:t>
       </w:r>
     </w:p>
     <w:p>
@@ -539,489 +1475,87 @@
         <w:t>Answer:</w:t>
       </w:r>
       <w:r>
-        <w:t xml:space="preserve"> I've automated UI end-to-end testing, API testing, database validation, smoke testing, regression testing, performance testing, and security testing. Each testing type </w:t>
-      </w:r>
-      <w:r>
+        <w:t xml:space="preserve"> I always use a risk-based approach. </w:t>
+      </w:r>
+    </w:p>
+    <w:p>
+      <w:pPr>
+        <w:pStyle w:val="ListParagraph"/>
+        <w:numPr>
+          <w:ilvl w:val="0"/>
+          <w:numId w:val="11"/>
+        </w:numPr>
+      </w:pPr>
+      <w:r>
+        <w:t>First, test the most critical business workflows.</w:t>
+      </w:r>
+    </w:p>
+    <w:p>
+      <w:pPr>
+        <w:pStyle w:val="ListParagraph"/>
+        <w:numPr>
+          <w:ilvl w:val="0"/>
+          <w:numId w:val="11"/>
+        </w:numPr>
+      </w:pPr>
+      <w:r>
+        <w:t>Next, test new features, high-risk changes, and integrations.</w:t>
+      </w:r>
+    </w:p>
+    <w:p>
+      <w:pPr>
+        <w:pStyle w:val="ListParagraph"/>
+        <w:numPr>
+          <w:ilvl w:val="0"/>
+          <w:numId w:val="11"/>
+        </w:numPr>
+      </w:pPr>
+      <w:r>
+        <w:t>Finally, verify data accuracy, performance, and security.</w:t>
+      </w:r>
+    </w:p>
+    <w:p>
+      <w:r>
+        <w:t>Always f</w:t>
+      </w:r>
+      <w:r>
+        <w:t xml:space="preserve">ocus testing </w:t>
+      </w:r>
+      <w:r>
+        <w:t>which</w:t>
+      </w:r>
+      <w:r>
+        <w:t xml:space="preserve"> provides the greatest business value.</w:t>
+      </w:r>
+    </w:p>
+    <w:p>
+      <w:r>
+        <w:rPr>
+          <w:b/>
+          <w:bCs/>
+        </w:rPr>
+        <w:t>Reference:</w:t>
+      </w:r>
+      <w:r>
+        <w:t xml:space="preserve"> Example 1 – Tank Limits Web Application</w:t>
+      </w:r>
+    </w:p>
+    <w:p>
+      <w:r>
+        <w:rPr>
+          <w:b/>
+          <w:bCs/>
+        </w:rPr>
+        <w:t>Q19. How would you test an app developed using AI, and how would you use AI during testing?</w:t>
+      </w:r>
+    </w:p>
+    <w:p>
+      <w:r>
+        <w:rPr>
+          <w:b/>
+          <w:bCs/>
+        </w:rPr>
         <w:lastRenderedPageBreak/>
-        <w:t>finds different categories of defects, so combining them provides better coverage and faster feedback than relying on UI automation alone.</w:t>
-      </w:r>
-    </w:p>
-    <w:p>
-      <w:r>
-        <w:rPr>
-          <w:b/>
-          <w:bCs/>
-        </w:rPr>
-        <w:t>Reference:</w:t>
-      </w:r>
-      <w:r>
-        <w:t xml:space="preserve"> Example 1 – Tank Limits Web Application, Example 3 – CI/CD Pipeline, Example 4 – API Automation</w:t>
-      </w:r>
-    </w:p>
-    <w:p>
-      <w:r>
-        <w:rPr>
-          <w:b/>
-          <w:bCs/>
-        </w:rPr>
-        <w:t>Q10. Can you describe your experience with API automation testing?</w:t>
-      </w:r>
-    </w:p>
-    <w:p>
-      <w:r>
-        <w:rPr>
-          <w:b/>
-          <w:bCs/>
-        </w:rPr>
-        <w:t>What is the interviewer really asking?</w:t>
-      </w:r>
-      <w:r>
-        <w:t xml:space="preserve"> Can you thoroughly validate APIs instead of only checking whether they return a successful status code? They want to know whether you understand authentication, validation, business rules, and backend verification.</w:t>
-      </w:r>
-    </w:p>
-    <w:p>
-      <w:r>
-        <w:rPr>
-          <w:b/>
-          <w:bCs/>
-        </w:rPr>
-        <w:t>Answer:</w:t>
-      </w:r>
-      <w:r>
-        <w:t xml:space="preserve"> I test REST APIs by validating request and response data, status codes, authentication, authorization, error handling, and business rules. For requests that modify data, I also verify the database to confirm the correct information was stored instead of relying only on the API response. API testing is fast, reliable, and allows me to validate business logic without depending on the user interface.</w:t>
-      </w:r>
-    </w:p>
-    <w:p>
-      <w:r>
-        <w:rPr>
-          <w:b/>
-          <w:bCs/>
-        </w:rPr>
-        <w:t>Reference:</w:t>
-      </w:r>
-      <w:r>
-        <w:t xml:space="preserve"> Example 4 – API Automation, Example 2 – SSO Authentication</w:t>
-      </w:r>
-    </w:p>
-    <w:p>
-      <w:r>
-        <w:rPr>
-          <w:b/>
-          <w:bCs/>
-        </w:rPr>
-        <w:t>Q11. Have you ever written custom utilities or wrappers for your automation framework?</w:t>
-      </w:r>
-    </w:p>
-    <w:p>
-      <w:r>
-        <w:rPr>
-          <w:b/>
-          <w:bCs/>
-        </w:rPr>
-        <w:t>What is the interviewer really asking?</w:t>
-      </w:r>
-      <w:r>
-        <w:t xml:space="preserve"> Can you design and maintain an automation framework instead of only writing individual test cases? They want to know whether you build reusable, maintainable solutions that make the entire team more productive.</w:t>
-      </w:r>
-    </w:p>
-    <w:p>
-      <w:r>
-        <w:rPr>
-          <w:b/>
-          <w:bCs/>
-        </w:rPr>
-        <w:t>Answer:</w:t>
-      </w:r>
-      <w:r>
-        <w:t xml:space="preserve"> Yes. I build reusable components such as custom commands, helper functions, shared test data, assertions, and utility methods to keep the test suite clean and maintainable. Instead of duplicating code across multiple tests, I centralize common functionality so updates only need to be made in one place. This improves readability, reduces maintenance, and makes the framework easier for the team to use.</w:t>
-      </w:r>
-    </w:p>
-    <w:p>
-      <w:r>
-        <w:rPr>
-          <w:b/>
-          <w:bCs/>
-        </w:rPr>
-        <w:t>Reference:</w:t>
-      </w:r>
-      <w:r>
-        <w:t xml:space="preserve"> Example 1 – Tank Limits Web Application</w:t>
-      </w:r>
-    </w:p>
-    <w:p>
-      <w:r>
-        <w:rPr>
-          <w:b/>
-          <w:bCs/>
-        </w:rPr>
-        <w:t xml:space="preserve">Q12. When would you use an array versus an </w:t>
-      </w:r>
-      <w:proofErr w:type="spellStart"/>
-      <w:r>
-        <w:rPr>
-          <w:b/>
-          <w:bCs/>
-        </w:rPr>
-        <w:t>ArrayList</w:t>
-      </w:r>
-      <w:proofErr w:type="spellEnd"/>
-      <w:r>
-        <w:rPr>
-          <w:b/>
-          <w:bCs/>
-        </w:rPr>
-        <w:t>?</w:t>
-      </w:r>
-    </w:p>
-    <w:p>
-      <w:r>
-        <w:rPr>
-          <w:b/>
-          <w:bCs/>
-        </w:rPr>
-        <w:t>What is the interviewer really asking?</w:t>
-      </w:r>
-      <w:r>
-        <w:t xml:space="preserve"> Do you have solid programming fundamentals, and can you explain basic concepts clearly? They're evaluating your coding knowledge more than your testing experience.</w:t>
-      </w:r>
-    </w:p>
-    <w:p>
-      <w:r>
-        <w:rPr>
-          <w:b/>
-          <w:bCs/>
-        </w:rPr>
-        <w:t>Answer:</w:t>
-      </w:r>
-      <w:r>
-        <w:t xml:space="preserve"> The answer depends on the programming language. In Java or C#, an array has a fixed size and is generally faster, while an </w:t>
-      </w:r>
-      <w:proofErr w:type="spellStart"/>
-      <w:r>
-        <w:t>ArrayList</w:t>
-      </w:r>
-      <w:proofErr w:type="spellEnd"/>
-      <w:r>
-        <w:t xml:space="preserve"> is dynamic and easier to use when the number of elements can change. In TypeScript or JavaScript, arrays are already dynamic, </w:t>
-      </w:r>
-      <w:r>
-        <w:lastRenderedPageBreak/>
-        <w:t>so the discussion is usually about choosing between an Array, Set, or Map depending on whether you need ordering, uniqueness, or key-value lookups. The important point is choosing the right data structure for the problem.</w:t>
-      </w:r>
-    </w:p>
-    <w:p>
-      <w:r>
-        <w:rPr>
-          <w:b/>
-          <w:bCs/>
-        </w:rPr>
-        <w:t>Reference:</w:t>
-      </w:r>
-      <w:r>
-        <w:t xml:space="preserve"> No project example needed.</w:t>
-      </w:r>
-    </w:p>
-    <w:p>
-      <w:r>
-        <w:rPr>
-          <w:b/>
-          <w:bCs/>
-        </w:rPr>
-        <w:t>Q13. What is a test automation framework and what are its key components?</w:t>
-      </w:r>
-    </w:p>
-    <w:p>
-      <w:r>
-        <w:rPr>
-          <w:b/>
-          <w:bCs/>
-        </w:rPr>
-        <w:t>What is the interviewer really asking?</w:t>
-      </w:r>
-      <w:r>
-        <w:t xml:space="preserve"> Do you understand how a complete automation solution is organized instead of thinking automation is just writing test scripts? They want to know whether you can design a framework that is maintainable and scalable.</w:t>
-      </w:r>
-    </w:p>
-    <w:p>
-      <w:r>
-        <w:rPr>
-          <w:b/>
-          <w:bCs/>
-        </w:rPr>
-        <w:t>Answer:</w:t>
-      </w:r>
-      <w:r>
-        <w:t xml:space="preserve"> A test automation framework is a structured way to organize and execute automated tests consistently. It typically includes a test runner, reusable test scripts, assertions, test data management, configuration, reporting, utilities, and CI/CD integration. A good framework makes tests easier to maintain, encourages code reuse, and allows the team to scale automation as the application grows.</w:t>
-      </w:r>
-    </w:p>
-    <w:p>
-      <w:r>
-        <w:rPr>
-          <w:b/>
-          <w:bCs/>
-        </w:rPr>
-        <w:t>Reference:</w:t>
-      </w:r>
-      <w:r>
-        <w:t xml:space="preserve"> Example 1 – Tank Limits Web Application, Example 3 – CI/CD Pipeline</w:t>
-      </w:r>
-    </w:p>
-    <w:p>
-      <w:r>
-        <w:rPr>
-          <w:b/>
-          <w:bCs/>
-        </w:rPr>
-        <w:t>Q14. What is black-box testing and white-box testing, and when would you use each?</w:t>
-      </w:r>
-    </w:p>
-    <w:p>
-      <w:r>
-        <w:rPr>
-          <w:b/>
-          <w:bCs/>
-        </w:rPr>
-        <w:t>What is the interviewer really asking?</w:t>
-      </w:r>
-      <w:r>
-        <w:t xml:space="preserve"> Can you think like both a QA engineer and a developer? They want to know whether you understand testing from both the user's perspective and the application's internal logic.</w:t>
-      </w:r>
-    </w:p>
-    <w:p>
-      <w:r>
-        <w:rPr>
-          <w:b/>
-          <w:bCs/>
-        </w:rPr>
-        <w:t>Answer:</w:t>
-      </w:r>
-      <w:r>
-        <w:t xml:space="preserve"> Black-box testing verifies the application's behavior without considering how the code is implemented, making it ideal for UI, API, and end-to-end testing. White-box testing focuses on the internal code, logic, and execution paths, making it more suitable for unit testing and code coverage. While most QA automation is black-box testing, being able to read code helps me design better test cases, identify edge cases, and troubleshoot failures more efficiently.</w:t>
-      </w:r>
-    </w:p>
-    <w:p>
-      <w:r>
-        <w:rPr>
-          <w:b/>
-          <w:bCs/>
-        </w:rPr>
-        <w:t>Reference:</w:t>
-      </w:r>
-      <w:r>
-        <w:t xml:space="preserve"> Example 4 – API Automation</w:t>
-      </w:r>
-    </w:p>
-    <w:p>
-      <w:r>
-        <w:rPr>
-          <w:b/>
-          <w:bCs/>
-        </w:rPr>
-        <w:t>Q15. We have an application that needs to handle 75,000 concurrent requests. How would you test it?</w:t>
-      </w:r>
-    </w:p>
-    <w:p>
-      <w:r>
-        <w:rPr>
-          <w:b/>
-          <w:bCs/>
-        </w:rPr>
-        <w:t>What is the interviewer really asking?</w:t>
-      </w:r>
-      <w:r>
-        <w:t xml:space="preserve"> Can you design a performance testing strategy instead of simply running a load testing tool? They want to know whether you understand scalability, system limits, monitoring, and performance goals.</w:t>
-      </w:r>
-    </w:p>
-    <w:p>
-      <w:r>
-        <w:rPr>
-          <w:b/>
-          <w:bCs/>
-        </w:rPr>
-        <w:t>Answer:</w:t>
-      </w:r>
-      <w:r>
-        <w:t xml:space="preserve"> I would first define the performance objectives, such as response time, throughput, and acceptable error rate. Then I'd perform load testing to verify the </w:t>
-      </w:r>
-      <w:r>
-        <w:lastRenderedPageBreak/>
-        <w:t>application can handle the expected traffic while monitoring CPU, memory, database connections, and system resources. If it meets the target, I'd continue with stress, spike, and endurance testing to understand the application's limits, recovery behavior, and long-term stability. Performance testing isn't just about generating traffic—it's about understanding how the entire system behaves under different conditions.</w:t>
-      </w:r>
-    </w:p>
-    <w:p>
-      <w:r>
-        <w:rPr>
-          <w:b/>
-          <w:bCs/>
-        </w:rPr>
-        <w:t>Reference:</w:t>
-      </w:r>
-      <w:r>
-        <w:t xml:space="preserve"> Example 3 – CI/CD Pipeline</w:t>
-      </w:r>
-    </w:p>
-    <w:p>
-      <w:r>
-        <w:rPr>
-          <w:b/>
-          <w:bCs/>
-        </w:rPr>
-        <w:t>Q16. What percentage of an application needs to be tested with automation?</w:t>
-      </w:r>
-    </w:p>
-    <w:p>
-      <w:r>
-        <w:rPr>
-          <w:b/>
-          <w:bCs/>
-        </w:rPr>
-        <w:t>What is the interviewer really asking?</w:t>
-      </w:r>
-      <w:r>
-        <w:t xml:space="preserve"> Do you understand the business value of automation instead of chasing 100% automation? They want to know whether you can balance automation coverage, maintenance cost, and return on investment.</w:t>
-      </w:r>
-    </w:p>
-    <w:p>
-      <w:r>
-        <w:rPr>
-          <w:b/>
-          <w:bCs/>
-        </w:rPr>
-        <w:t>Answer:</w:t>
-      </w:r>
-      <w:r>
-        <w:t xml:space="preserve"> There isn't a fixed percentage because it depends on the application, business risk, team resources, and how often features change. My goal is to automate as much of the stable, high-value regression testing as practical while keeping </w:t>
-      </w:r>
-      <w:proofErr w:type="gramStart"/>
-      <w:r>
-        <w:t>exploratory</w:t>
-      </w:r>
-      <w:proofErr w:type="gramEnd"/>
-      <w:r>
-        <w:t>, usability, and rapidly changing features manual. Automation should maximize business value, not simply increase coverage numbers.</w:t>
-      </w:r>
-    </w:p>
-    <w:p>
-      <w:r>
-        <w:rPr>
-          <w:b/>
-          <w:bCs/>
-        </w:rPr>
-        <w:t>Reference:</w:t>
-      </w:r>
-      <w:r>
-        <w:t xml:space="preserve"> Example 1 – Tank Limits Web Application, Example 2 – SSO Authentication</w:t>
-      </w:r>
-    </w:p>
-    <w:p>
-      <w:r>
-        <w:rPr>
-          <w:b/>
-          <w:bCs/>
-        </w:rPr>
-        <w:t>Q17. Describe a project and what role you played as a QA.</w:t>
-      </w:r>
-    </w:p>
-    <w:p>
-      <w:r>
-        <w:rPr>
-          <w:b/>
-          <w:bCs/>
-        </w:rPr>
-        <w:t>What is the interviewer really asking?</w:t>
-      </w:r>
-      <w:r>
-        <w:t xml:space="preserve"> Can you clearly explain your experience, your responsibilities, the technologies you used, and the impact you made? They want to understand what you personally contributed, not what the team accomplished.</w:t>
-      </w:r>
-    </w:p>
-    <w:p>
-      <w:r>
-        <w:rPr>
-          <w:b/>
-          <w:bCs/>
-        </w:rPr>
-        <w:t>Answer:</w:t>
-      </w:r>
-      <w:r>
-        <w:t xml:space="preserve"> I start by explaining what the application does, then describe my responsibilities, the tools I used, and the results I achieved. I focus on my own contributions, such as designing the automation framework, creating automated tests, integrating CI/CD, improving test coverage, investigating defects, and helping the team deliver reliable releases. I always finish with measurable business value whenever possible.</w:t>
-      </w:r>
-    </w:p>
-    <w:p>
-      <w:r>
-        <w:rPr>
-          <w:b/>
-          <w:bCs/>
-        </w:rPr>
-        <w:t>Reference:</w:t>
-      </w:r>
-      <w:r>
-        <w:t xml:space="preserve"> Example 1 – Tank Limits Web Application</w:t>
-      </w:r>
-    </w:p>
-    <w:p>
-      <w:r>
-        <w:rPr>
-          <w:b/>
-          <w:bCs/>
-        </w:rPr>
-        <w:t>Q18. What would you focus on during testing any project?</w:t>
-      </w:r>
-    </w:p>
-    <w:p>
-      <w:r>
-        <w:rPr>
-          <w:b/>
-          <w:bCs/>
-        </w:rPr>
-        <w:t>What is the interviewer really asking?</w:t>
-      </w:r>
-      <w:r>
-        <w:t xml:space="preserve"> Can you prioritize testing based on business risk instead of trying to test everything equally? They want to know how you decide what deserves the most attention.</w:t>
-      </w:r>
-    </w:p>
-    <w:p>
-      <w:r>
-        <w:rPr>
-          <w:b/>
-          <w:bCs/>
-        </w:rPr>
-        <w:t>Answer:</w:t>
-      </w:r>
-      <w:r>
-        <w:t xml:space="preserve"> I always use a risk-based approach. I begin with the most critical business workflows because failures there have the greatest impact on users. Next, I focus on new </w:t>
-      </w:r>
-      <w:r>
-        <w:lastRenderedPageBreak/>
-        <w:t>features, high-risk changes, and system integrations. Finally, I verify data accuracy, performance, and security. My goal is to spend the most testing effort where it provides the greatest value to the business.</w:t>
-      </w:r>
-    </w:p>
-    <w:p>
-      <w:r>
-        <w:rPr>
-          <w:b/>
-          <w:bCs/>
-        </w:rPr>
-        <w:t>Reference:</w:t>
-      </w:r>
-      <w:r>
-        <w:t xml:space="preserve"> Example 1 – Tank Limits Web Application</w:t>
-      </w:r>
-    </w:p>
-    <w:p>
-      <w:r>
-        <w:rPr>
-          <w:b/>
-          <w:bCs/>
-        </w:rPr>
-        <w:t>Q19. How would you test an app developed using AI, and how would you use AI during testing?</w:t>
-      </w:r>
-    </w:p>
-    <w:p>
-      <w:r>
-        <w:rPr>
-          <w:b/>
-          <w:bCs/>
-        </w:rPr>
         <w:t>What is the interviewer really asking?</w:t>
       </w:r>
       <w:r>
@@ -1262,6 +1796,345 @@
     </w:lvl>
   </w:abstractNum>
   <w:abstractNum w:abstractNumId="1" w15:restartNumberingAfterBreak="0">
+    <w:nsid w:val="111D3669"/>
+    <w:multiLevelType w:val="hybridMultilevel"/>
+    <w:tmpl w:val="0CEACF3E"/>
+    <w:lvl w:ilvl="0" w:tplc="04090001">
+      <w:start w:val="1"/>
+      <w:numFmt w:val="bullet"/>
+      <w:lvlText w:val=""/>
+      <w:lvlJc w:val="left"/>
+      <w:pPr>
+        <w:ind w:left="720" w:hanging="360"/>
+      </w:pPr>
+      <w:rPr>
+        <w:rFonts w:ascii="Symbol" w:hAnsi="Symbol" w:hint="default"/>
+      </w:rPr>
+    </w:lvl>
+    <w:lvl w:ilvl="1" w:tplc="04090003" w:tentative="1">
+      <w:start w:val="1"/>
+      <w:numFmt w:val="bullet"/>
+      <w:lvlText w:val="o"/>
+      <w:lvlJc w:val="left"/>
+      <w:pPr>
+        <w:ind w:left="1440" w:hanging="360"/>
+      </w:pPr>
+      <w:rPr>
+        <w:rFonts w:ascii="Courier New" w:hAnsi="Courier New" w:cs="Courier New" w:hint="default"/>
+      </w:rPr>
+    </w:lvl>
+    <w:lvl w:ilvl="2" w:tplc="04090005" w:tentative="1">
+      <w:start w:val="1"/>
+      <w:numFmt w:val="bullet"/>
+      <w:lvlText w:val=""/>
+      <w:lvlJc w:val="left"/>
+      <w:pPr>
+        <w:ind w:left="2160" w:hanging="360"/>
+      </w:pPr>
+      <w:rPr>
+        <w:rFonts w:ascii="Wingdings" w:hAnsi="Wingdings" w:hint="default"/>
+      </w:rPr>
+    </w:lvl>
+    <w:lvl w:ilvl="3" w:tplc="04090001" w:tentative="1">
+      <w:start w:val="1"/>
+      <w:numFmt w:val="bullet"/>
+      <w:lvlText w:val=""/>
+      <w:lvlJc w:val="left"/>
+      <w:pPr>
+        <w:ind w:left="2880" w:hanging="360"/>
+      </w:pPr>
+      <w:rPr>
+        <w:rFonts w:ascii="Symbol" w:hAnsi="Symbol" w:hint="default"/>
+      </w:rPr>
+    </w:lvl>
+    <w:lvl w:ilvl="4" w:tplc="04090003" w:tentative="1">
+      <w:start w:val="1"/>
+      <w:numFmt w:val="bullet"/>
+      <w:lvlText w:val="o"/>
+      <w:lvlJc w:val="left"/>
+      <w:pPr>
+        <w:ind w:left="3600" w:hanging="360"/>
+      </w:pPr>
+      <w:rPr>
+        <w:rFonts w:ascii="Courier New" w:hAnsi="Courier New" w:cs="Courier New" w:hint="default"/>
+      </w:rPr>
+    </w:lvl>
+    <w:lvl w:ilvl="5" w:tplc="04090005" w:tentative="1">
+      <w:start w:val="1"/>
+      <w:numFmt w:val="bullet"/>
+      <w:lvlText w:val=""/>
+      <w:lvlJc w:val="left"/>
+      <w:pPr>
+        <w:ind w:left="4320" w:hanging="360"/>
+      </w:pPr>
+      <w:rPr>
+        <w:rFonts w:ascii="Wingdings" w:hAnsi="Wingdings" w:hint="default"/>
+      </w:rPr>
+    </w:lvl>
+    <w:lvl w:ilvl="6" w:tplc="04090001" w:tentative="1">
+      <w:start w:val="1"/>
+      <w:numFmt w:val="bullet"/>
+      <w:lvlText w:val=""/>
+      <w:lvlJc w:val="left"/>
+      <w:pPr>
+        <w:ind w:left="5040" w:hanging="360"/>
+      </w:pPr>
+      <w:rPr>
+        <w:rFonts w:ascii="Symbol" w:hAnsi="Symbol" w:hint="default"/>
+      </w:rPr>
+    </w:lvl>
+    <w:lvl w:ilvl="7" w:tplc="04090003" w:tentative="1">
+      <w:start w:val="1"/>
+      <w:numFmt w:val="bullet"/>
+      <w:lvlText w:val="o"/>
+      <w:lvlJc w:val="left"/>
+      <w:pPr>
+        <w:ind w:left="5760" w:hanging="360"/>
+      </w:pPr>
+      <w:rPr>
+        <w:rFonts w:ascii="Courier New" w:hAnsi="Courier New" w:cs="Courier New" w:hint="default"/>
+      </w:rPr>
+    </w:lvl>
+    <w:lvl w:ilvl="8" w:tplc="04090005" w:tentative="1">
+      <w:start w:val="1"/>
+      <w:numFmt w:val="bullet"/>
+      <w:lvlText w:val=""/>
+      <w:lvlJc w:val="left"/>
+      <w:pPr>
+        <w:ind w:left="6480" w:hanging="360"/>
+      </w:pPr>
+      <w:rPr>
+        <w:rFonts w:ascii="Wingdings" w:hAnsi="Wingdings" w:hint="default"/>
+      </w:rPr>
+    </w:lvl>
+  </w:abstractNum>
+  <w:abstractNum w:abstractNumId="2" w15:restartNumberingAfterBreak="0">
+    <w:nsid w:val="1E0A0ED1"/>
+    <w:multiLevelType w:val="hybridMultilevel"/>
+    <w:tmpl w:val="13CCCDEC"/>
+    <w:lvl w:ilvl="0" w:tplc="04090001">
+      <w:start w:val="1"/>
+      <w:numFmt w:val="bullet"/>
+      <w:lvlText w:val=""/>
+      <w:lvlJc w:val="left"/>
+      <w:pPr>
+        <w:ind w:left="720" w:hanging="360"/>
+      </w:pPr>
+      <w:rPr>
+        <w:rFonts w:ascii="Symbol" w:hAnsi="Symbol" w:hint="default"/>
+      </w:rPr>
+    </w:lvl>
+    <w:lvl w:ilvl="1" w:tplc="04090003" w:tentative="1">
+      <w:start w:val="1"/>
+      <w:numFmt w:val="bullet"/>
+      <w:lvlText w:val="o"/>
+      <w:lvlJc w:val="left"/>
+      <w:pPr>
+        <w:ind w:left="1440" w:hanging="360"/>
+      </w:pPr>
+      <w:rPr>
+        <w:rFonts w:ascii="Courier New" w:hAnsi="Courier New" w:cs="Courier New" w:hint="default"/>
+      </w:rPr>
+    </w:lvl>
+    <w:lvl w:ilvl="2" w:tplc="04090005" w:tentative="1">
+      <w:start w:val="1"/>
+      <w:numFmt w:val="bullet"/>
+      <w:lvlText w:val=""/>
+      <w:lvlJc w:val="left"/>
+      <w:pPr>
+        <w:ind w:left="2160" w:hanging="360"/>
+      </w:pPr>
+      <w:rPr>
+        <w:rFonts w:ascii="Wingdings" w:hAnsi="Wingdings" w:hint="default"/>
+      </w:rPr>
+    </w:lvl>
+    <w:lvl w:ilvl="3" w:tplc="04090001" w:tentative="1">
+      <w:start w:val="1"/>
+      <w:numFmt w:val="bullet"/>
+      <w:lvlText w:val=""/>
+      <w:lvlJc w:val="left"/>
+      <w:pPr>
+        <w:ind w:left="2880" w:hanging="360"/>
+      </w:pPr>
+      <w:rPr>
+        <w:rFonts w:ascii="Symbol" w:hAnsi="Symbol" w:hint="default"/>
+      </w:rPr>
+    </w:lvl>
+    <w:lvl w:ilvl="4" w:tplc="04090003" w:tentative="1">
+      <w:start w:val="1"/>
+      <w:numFmt w:val="bullet"/>
+      <w:lvlText w:val="o"/>
+      <w:lvlJc w:val="left"/>
+      <w:pPr>
+        <w:ind w:left="3600" w:hanging="360"/>
+      </w:pPr>
+      <w:rPr>
+        <w:rFonts w:ascii="Courier New" w:hAnsi="Courier New" w:cs="Courier New" w:hint="default"/>
+      </w:rPr>
+    </w:lvl>
+    <w:lvl w:ilvl="5" w:tplc="04090005" w:tentative="1">
+      <w:start w:val="1"/>
+      <w:numFmt w:val="bullet"/>
+      <w:lvlText w:val=""/>
+      <w:lvlJc w:val="left"/>
+      <w:pPr>
+        <w:ind w:left="4320" w:hanging="360"/>
+      </w:pPr>
+      <w:rPr>
+        <w:rFonts w:ascii="Wingdings" w:hAnsi="Wingdings" w:hint="default"/>
+      </w:rPr>
+    </w:lvl>
+    <w:lvl w:ilvl="6" w:tplc="04090001" w:tentative="1">
+      <w:start w:val="1"/>
+      <w:numFmt w:val="bullet"/>
+      <w:lvlText w:val=""/>
+      <w:lvlJc w:val="left"/>
+      <w:pPr>
+        <w:ind w:left="5040" w:hanging="360"/>
+      </w:pPr>
+      <w:rPr>
+        <w:rFonts w:ascii="Symbol" w:hAnsi="Symbol" w:hint="default"/>
+      </w:rPr>
+    </w:lvl>
+    <w:lvl w:ilvl="7" w:tplc="04090003" w:tentative="1">
+      <w:start w:val="1"/>
+      <w:numFmt w:val="bullet"/>
+      <w:lvlText w:val="o"/>
+      <w:lvlJc w:val="left"/>
+      <w:pPr>
+        <w:ind w:left="5760" w:hanging="360"/>
+      </w:pPr>
+      <w:rPr>
+        <w:rFonts w:ascii="Courier New" w:hAnsi="Courier New" w:cs="Courier New" w:hint="default"/>
+      </w:rPr>
+    </w:lvl>
+    <w:lvl w:ilvl="8" w:tplc="04090005" w:tentative="1">
+      <w:start w:val="1"/>
+      <w:numFmt w:val="bullet"/>
+      <w:lvlText w:val=""/>
+      <w:lvlJc w:val="left"/>
+      <w:pPr>
+        <w:ind w:left="6480" w:hanging="360"/>
+      </w:pPr>
+      <w:rPr>
+        <w:rFonts w:ascii="Wingdings" w:hAnsi="Wingdings" w:hint="default"/>
+      </w:rPr>
+    </w:lvl>
+  </w:abstractNum>
+  <w:abstractNum w:abstractNumId="3" w15:restartNumberingAfterBreak="0">
+    <w:nsid w:val="283522DF"/>
+    <w:multiLevelType w:val="hybridMultilevel"/>
+    <w:tmpl w:val="1638CD58"/>
+    <w:lvl w:ilvl="0" w:tplc="04090001">
+      <w:start w:val="1"/>
+      <w:numFmt w:val="bullet"/>
+      <w:lvlText w:val=""/>
+      <w:lvlJc w:val="left"/>
+      <w:pPr>
+        <w:ind w:left="720" w:hanging="360"/>
+      </w:pPr>
+      <w:rPr>
+        <w:rFonts w:ascii="Symbol" w:hAnsi="Symbol" w:hint="default"/>
+      </w:rPr>
+    </w:lvl>
+    <w:lvl w:ilvl="1" w:tplc="04090003" w:tentative="1">
+      <w:start w:val="1"/>
+      <w:numFmt w:val="bullet"/>
+      <w:lvlText w:val="o"/>
+      <w:lvlJc w:val="left"/>
+      <w:pPr>
+        <w:ind w:left="1440" w:hanging="360"/>
+      </w:pPr>
+      <w:rPr>
+        <w:rFonts w:ascii="Courier New" w:hAnsi="Courier New" w:cs="Courier New" w:hint="default"/>
+      </w:rPr>
+    </w:lvl>
+    <w:lvl w:ilvl="2" w:tplc="04090005" w:tentative="1">
+      <w:start w:val="1"/>
+      <w:numFmt w:val="bullet"/>
+      <w:lvlText w:val=""/>
+      <w:lvlJc w:val="left"/>
+      <w:pPr>
+        <w:ind w:left="2160" w:hanging="360"/>
+      </w:pPr>
+      <w:rPr>
+        <w:rFonts w:ascii="Wingdings" w:hAnsi="Wingdings" w:hint="default"/>
+      </w:rPr>
+    </w:lvl>
+    <w:lvl w:ilvl="3" w:tplc="04090001" w:tentative="1">
+      <w:start w:val="1"/>
+      <w:numFmt w:val="bullet"/>
+      <w:lvlText w:val=""/>
+      <w:lvlJc w:val="left"/>
+      <w:pPr>
+        <w:ind w:left="2880" w:hanging="360"/>
+      </w:pPr>
+      <w:rPr>
+        <w:rFonts w:ascii="Symbol" w:hAnsi="Symbol" w:hint="default"/>
+      </w:rPr>
+    </w:lvl>
+    <w:lvl w:ilvl="4" w:tplc="04090003" w:tentative="1">
+      <w:start w:val="1"/>
+      <w:numFmt w:val="bullet"/>
+      <w:lvlText w:val="o"/>
+      <w:lvlJc w:val="left"/>
+      <w:pPr>
+        <w:ind w:left="3600" w:hanging="360"/>
+      </w:pPr>
+      <w:rPr>
+        <w:rFonts w:ascii="Courier New" w:hAnsi="Courier New" w:cs="Courier New" w:hint="default"/>
+      </w:rPr>
+    </w:lvl>
+    <w:lvl w:ilvl="5" w:tplc="04090005" w:tentative="1">
+      <w:start w:val="1"/>
+      <w:numFmt w:val="bullet"/>
+      <w:lvlText w:val=""/>
+      <w:lvlJc w:val="left"/>
+      <w:pPr>
+        <w:ind w:left="4320" w:hanging="360"/>
+      </w:pPr>
+      <w:rPr>
+        <w:rFonts w:ascii="Wingdings" w:hAnsi="Wingdings" w:hint="default"/>
+      </w:rPr>
+    </w:lvl>
+    <w:lvl w:ilvl="6" w:tplc="04090001" w:tentative="1">
+      <w:start w:val="1"/>
+      <w:numFmt w:val="bullet"/>
+      <w:lvlText w:val=""/>
+      <w:lvlJc w:val="left"/>
+      <w:pPr>
+        <w:ind w:left="5040" w:hanging="360"/>
+      </w:pPr>
+      <w:rPr>
+        <w:rFonts w:ascii="Symbol" w:hAnsi="Symbol" w:hint="default"/>
+      </w:rPr>
+    </w:lvl>
+    <w:lvl w:ilvl="7" w:tplc="04090003" w:tentative="1">
+      <w:start w:val="1"/>
+      <w:numFmt w:val="bullet"/>
+      <w:lvlText w:val="o"/>
+      <w:lvlJc w:val="left"/>
+      <w:pPr>
+        <w:ind w:left="5760" w:hanging="360"/>
+      </w:pPr>
+      <w:rPr>
+        <w:rFonts w:ascii="Courier New" w:hAnsi="Courier New" w:cs="Courier New" w:hint="default"/>
+      </w:rPr>
+    </w:lvl>
+    <w:lvl w:ilvl="8" w:tplc="04090005" w:tentative="1">
+      <w:start w:val="1"/>
+      <w:numFmt w:val="bullet"/>
+      <w:lvlText w:val=""/>
+      <w:lvlJc w:val="left"/>
+      <w:pPr>
+        <w:ind w:left="6480" w:hanging="360"/>
+      </w:pPr>
+      <w:rPr>
+        <w:rFonts w:ascii="Wingdings" w:hAnsi="Wingdings" w:hint="default"/>
+      </w:rPr>
+    </w:lvl>
+  </w:abstractNum>
+  <w:abstractNum w:abstractNumId="4" w15:restartNumberingAfterBreak="0">
     <w:nsid w:val="28E33A1D"/>
     <w:multiLevelType w:val="multilevel"/>
     <w:tmpl w:val="7520D0A2"/>
@@ -1410,7 +2283,7 @@
       </w:rPr>
     </w:lvl>
   </w:abstractNum>
-  <w:abstractNum w:abstractNumId="2" w15:restartNumberingAfterBreak="0">
+  <w:abstractNum w:abstractNumId="5" w15:restartNumberingAfterBreak="0">
     <w:nsid w:val="2AEB3D07"/>
     <w:multiLevelType w:val="multilevel"/>
     <w:tmpl w:val="0D6E7AE8"/>
@@ -1559,7 +2432,860 @@
       </w:rPr>
     </w:lvl>
   </w:abstractNum>
-  <w:abstractNum w:abstractNumId="3" w15:restartNumberingAfterBreak="0">
+  <w:abstractNum w:abstractNumId="6" w15:restartNumberingAfterBreak="0">
+    <w:nsid w:val="2D990D15"/>
+    <w:multiLevelType w:val="hybridMultilevel"/>
+    <w:tmpl w:val="2F72B5FC"/>
+    <w:lvl w:ilvl="0" w:tplc="04090001">
+      <w:start w:val="1"/>
+      <w:numFmt w:val="bullet"/>
+      <w:lvlText w:val=""/>
+      <w:lvlJc w:val="left"/>
+      <w:pPr>
+        <w:ind w:left="720" w:hanging="360"/>
+      </w:pPr>
+      <w:rPr>
+        <w:rFonts w:ascii="Symbol" w:hAnsi="Symbol" w:hint="default"/>
+      </w:rPr>
+    </w:lvl>
+    <w:lvl w:ilvl="1" w:tplc="04090003" w:tentative="1">
+      <w:start w:val="1"/>
+      <w:numFmt w:val="bullet"/>
+      <w:lvlText w:val="o"/>
+      <w:lvlJc w:val="left"/>
+      <w:pPr>
+        <w:ind w:left="1440" w:hanging="360"/>
+      </w:pPr>
+      <w:rPr>
+        <w:rFonts w:ascii="Courier New" w:hAnsi="Courier New" w:cs="Courier New" w:hint="default"/>
+      </w:rPr>
+    </w:lvl>
+    <w:lvl w:ilvl="2" w:tplc="04090005" w:tentative="1">
+      <w:start w:val="1"/>
+      <w:numFmt w:val="bullet"/>
+      <w:lvlText w:val=""/>
+      <w:lvlJc w:val="left"/>
+      <w:pPr>
+        <w:ind w:left="2160" w:hanging="360"/>
+      </w:pPr>
+      <w:rPr>
+        <w:rFonts w:ascii="Wingdings" w:hAnsi="Wingdings" w:hint="default"/>
+      </w:rPr>
+    </w:lvl>
+    <w:lvl w:ilvl="3" w:tplc="04090001" w:tentative="1">
+      <w:start w:val="1"/>
+      <w:numFmt w:val="bullet"/>
+      <w:lvlText w:val=""/>
+      <w:lvlJc w:val="left"/>
+      <w:pPr>
+        <w:ind w:left="2880" w:hanging="360"/>
+      </w:pPr>
+      <w:rPr>
+        <w:rFonts w:ascii="Symbol" w:hAnsi="Symbol" w:hint="default"/>
+      </w:rPr>
+    </w:lvl>
+    <w:lvl w:ilvl="4" w:tplc="04090003" w:tentative="1">
+      <w:start w:val="1"/>
+      <w:numFmt w:val="bullet"/>
+      <w:lvlText w:val="o"/>
+      <w:lvlJc w:val="left"/>
+      <w:pPr>
+        <w:ind w:left="3600" w:hanging="360"/>
+      </w:pPr>
+      <w:rPr>
+        <w:rFonts w:ascii="Courier New" w:hAnsi="Courier New" w:cs="Courier New" w:hint="default"/>
+      </w:rPr>
+    </w:lvl>
+    <w:lvl w:ilvl="5" w:tplc="04090005" w:tentative="1">
+      <w:start w:val="1"/>
+      <w:numFmt w:val="bullet"/>
+      <w:lvlText w:val=""/>
+      <w:lvlJc w:val="left"/>
+      <w:pPr>
+        <w:ind w:left="4320" w:hanging="360"/>
+      </w:pPr>
+      <w:rPr>
+        <w:rFonts w:ascii="Wingdings" w:hAnsi="Wingdings" w:hint="default"/>
+      </w:rPr>
+    </w:lvl>
+    <w:lvl w:ilvl="6" w:tplc="04090001" w:tentative="1">
+      <w:start w:val="1"/>
+      <w:numFmt w:val="bullet"/>
+      <w:lvlText w:val=""/>
+      <w:lvlJc w:val="left"/>
+      <w:pPr>
+        <w:ind w:left="5040" w:hanging="360"/>
+      </w:pPr>
+      <w:rPr>
+        <w:rFonts w:ascii="Symbol" w:hAnsi="Symbol" w:hint="default"/>
+      </w:rPr>
+    </w:lvl>
+    <w:lvl w:ilvl="7" w:tplc="04090003" w:tentative="1">
+      <w:start w:val="1"/>
+      <w:numFmt w:val="bullet"/>
+      <w:lvlText w:val="o"/>
+      <w:lvlJc w:val="left"/>
+      <w:pPr>
+        <w:ind w:left="5760" w:hanging="360"/>
+      </w:pPr>
+      <w:rPr>
+        <w:rFonts w:ascii="Courier New" w:hAnsi="Courier New" w:cs="Courier New" w:hint="default"/>
+      </w:rPr>
+    </w:lvl>
+    <w:lvl w:ilvl="8" w:tplc="04090005" w:tentative="1">
+      <w:start w:val="1"/>
+      <w:numFmt w:val="bullet"/>
+      <w:lvlText w:val=""/>
+      <w:lvlJc w:val="left"/>
+      <w:pPr>
+        <w:ind w:left="6480" w:hanging="360"/>
+      </w:pPr>
+      <w:rPr>
+        <w:rFonts w:ascii="Wingdings" w:hAnsi="Wingdings" w:hint="default"/>
+      </w:rPr>
+    </w:lvl>
+  </w:abstractNum>
+  <w:abstractNum w:abstractNumId="7" w15:restartNumberingAfterBreak="0">
+    <w:nsid w:val="2ED4470A"/>
+    <w:multiLevelType w:val="hybridMultilevel"/>
+    <w:tmpl w:val="3BA82FCE"/>
+    <w:lvl w:ilvl="0" w:tplc="04090001">
+      <w:start w:val="1"/>
+      <w:numFmt w:val="bullet"/>
+      <w:lvlText w:val=""/>
+      <w:lvlJc w:val="left"/>
+      <w:pPr>
+        <w:ind w:left="720" w:hanging="360"/>
+      </w:pPr>
+      <w:rPr>
+        <w:rFonts w:ascii="Symbol" w:hAnsi="Symbol" w:hint="default"/>
+      </w:rPr>
+    </w:lvl>
+    <w:lvl w:ilvl="1" w:tplc="04090003" w:tentative="1">
+      <w:start w:val="1"/>
+      <w:numFmt w:val="bullet"/>
+      <w:lvlText w:val="o"/>
+      <w:lvlJc w:val="left"/>
+      <w:pPr>
+        <w:ind w:left="1440" w:hanging="360"/>
+      </w:pPr>
+      <w:rPr>
+        <w:rFonts w:ascii="Courier New" w:hAnsi="Courier New" w:cs="Courier New" w:hint="default"/>
+      </w:rPr>
+    </w:lvl>
+    <w:lvl w:ilvl="2" w:tplc="04090005" w:tentative="1">
+      <w:start w:val="1"/>
+      <w:numFmt w:val="bullet"/>
+      <w:lvlText w:val=""/>
+      <w:lvlJc w:val="left"/>
+      <w:pPr>
+        <w:ind w:left="2160" w:hanging="360"/>
+      </w:pPr>
+      <w:rPr>
+        <w:rFonts w:ascii="Wingdings" w:hAnsi="Wingdings" w:hint="default"/>
+      </w:rPr>
+    </w:lvl>
+    <w:lvl w:ilvl="3" w:tplc="04090001" w:tentative="1">
+      <w:start w:val="1"/>
+      <w:numFmt w:val="bullet"/>
+      <w:lvlText w:val=""/>
+      <w:lvlJc w:val="left"/>
+      <w:pPr>
+        <w:ind w:left="2880" w:hanging="360"/>
+      </w:pPr>
+      <w:rPr>
+        <w:rFonts w:ascii="Symbol" w:hAnsi="Symbol" w:hint="default"/>
+      </w:rPr>
+    </w:lvl>
+    <w:lvl w:ilvl="4" w:tplc="04090003" w:tentative="1">
+      <w:start w:val="1"/>
+      <w:numFmt w:val="bullet"/>
+      <w:lvlText w:val="o"/>
+      <w:lvlJc w:val="left"/>
+      <w:pPr>
+        <w:ind w:left="3600" w:hanging="360"/>
+      </w:pPr>
+      <w:rPr>
+        <w:rFonts w:ascii="Courier New" w:hAnsi="Courier New" w:cs="Courier New" w:hint="default"/>
+      </w:rPr>
+    </w:lvl>
+    <w:lvl w:ilvl="5" w:tplc="04090005" w:tentative="1">
+      <w:start w:val="1"/>
+      <w:numFmt w:val="bullet"/>
+      <w:lvlText w:val=""/>
+      <w:lvlJc w:val="left"/>
+      <w:pPr>
+        <w:ind w:left="4320" w:hanging="360"/>
+      </w:pPr>
+      <w:rPr>
+        <w:rFonts w:ascii="Wingdings" w:hAnsi="Wingdings" w:hint="default"/>
+      </w:rPr>
+    </w:lvl>
+    <w:lvl w:ilvl="6" w:tplc="04090001" w:tentative="1">
+      <w:start w:val="1"/>
+      <w:numFmt w:val="bullet"/>
+      <w:lvlText w:val=""/>
+      <w:lvlJc w:val="left"/>
+      <w:pPr>
+        <w:ind w:left="5040" w:hanging="360"/>
+      </w:pPr>
+      <w:rPr>
+        <w:rFonts w:ascii="Symbol" w:hAnsi="Symbol" w:hint="default"/>
+      </w:rPr>
+    </w:lvl>
+    <w:lvl w:ilvl="7" w:tplc="04090003" w:tentative="1">
+      <w:start w:val="1"/>
+      <w:numFmt w:val="bullet"/>
+      <w:lvlText w:val="o"/>
+      <w:lvlJc w:val="left"/>
+      <w:pPr>
+        <w:ind w:left="5760" w:hanging="360"/>
+      </w:pPr>
+      <w:rPr>
+        <w:rFonts w:ascii="Courier New" w:hAnsi="Courier New" w:cs="Courier New" w:hint="default"/>
+      </w:rPr>
+    </w:lvl>
+    <w:lvl w:ilvl="8" w:tplc="04090005" w:tentative="1">
+      <w:start w:val="1"/>
+      <w:numFmt w:val="bullet"/>
+      <w:lvlText w:val=""/>
+      <w:lvlJc w:val="left"/>
+      <w:pPr>
+        <w:ind w:left="6480" w:hanging="360"/>
+      </w:pPr>
+      <w:rPr>
+        <w:rFonts w:ascii="Wingdings" w:hAnsi="Wingdings" w:hint="default"/>
+      </w:rPr>
+    </w:lvl>
+  </w:abstractNum>
+  <w:abstractNum w:abstractNumId="8" w15:restartNumberingAfterBreak="0">
+    <w:nsid w:val="4751341D"/>
+    <w:multiLevelType w:val="hybridMultilevel"/>
+    <w:tmpl w:val="12A0F4A8"/>
+    <w:lvl w:ilvl="0" w:tplc="04090001">
+      <w:start w:val="1"/>
+      <w:numFmt w:val="bullet"/>
+      <w:lvlText w:val=""/>
+      <w:lvlJc w:val="left"/>
+      <w:pPr>
+        <w:ind w:left="720" w:hanging="360"/>
+      </w:pPr>
+      <w:rPr>
+        <w:rFonts w:ascii="Symbol" w:hAnsi="Symbol" w:hint="default"/>
+      </w:rPr>
+    </w:lvl>
+    <w:lvl w:ilvl="1" w:tplc="04090003" w:tentative="1">
+      <w:start w:val="1"/>
+      <w:numFmt w:val="bullet"/>
+      <w:lvlText w:val="o"/>
+      <w:lvlJc w:val="left"/>
+      <w:pPr>
+        <w:ind w:left="1440" w:hanging="360"/>
+      </w:pPr>
+      <w:rPr>
+        <w:rFonts w:ascii="Courier New" w:hAnsi="Courier New" w:cs="Courier New" w:hint="default"/>
+      </w:rPr>
+    </w:lvl>
+    <w:lvl w:ilvl="2" w:tplc="04090005" w:tentative="1">
+      <w:start w:val="1"/>
+      <w:numFmt w:val="bullet"/>
+      <w:lvlText w:val=""/>
+      <w:lvlJc w:val="left"/>
+      <w:pPr>
+        <w:ind w:left="2160" w:hanging="360"/>
+      </w:pPr>
+      <w:rPr>
+        <w:rFonts w:ascii="Wingdings" w:hAnsi="Wingdings" w:hint="default"/>
+      </w:rPr>
+    </w:lvl>
+    <w:lvl w:ilvl="3" w:tplc="04090001" w:tentative="1">
+      <w:start w:val="1"/>
+      <w:numFmt w:val="bullet"/>
+      <w:lvlText w:val=""/>
+      <w:lvlJc w:val="left"/>
+      <w:pPr>
+        <w:ind w:left="2880" w:hanging="360"/>
+      </w:pPr>
+      <w:rPr>
+        <w:rFonts w:ascii="Symbol" w:hAnsi="Symbol" w:hint="default"/>
+      </w:rPr>
+    </w:lvl>
+    <w:lvl w:ilvl="4" w:tplc="04090003" w:tentative="1">
+      <w:start w:val="1"/>
+      <w:numFmt w:val="bullet"/>
+      <w:lvlText w:val="o"/>
+      <w:lvlJc w:val="left"/>
+      <w:pPr>
+        <w:ind w:left="3600" w:hanging="360"/>
+      </w:pPr>
+      <w:rPr>
+        <w:rFonts w:ascii="Courier New" w:hAnsi="Courier New" w:cs="Courier New" w:hint="default"/>
+      </w:rPr>
+    </w:lvl>
+    <w:lvl w:ilvl="5" w:tplc="04090005" w:tentative="1">
+      <w:start w:val="1"/>
+      <w:numFmt w:val="bullet"/>
+      <w:lvlText w:val=""/>
+      <w:lvlJc w:val="left"/>
+      <w:pPr>
+        <w:ind w:left="4320" w:hanging="360"/>
+      </w:pPr>
+      <w:rPr>
+        <w:rFonts w:ascii="Wingdings" w:hAnsi="Wingdings" w:hint="default"/>
+      </w:rPr>
+    </w:lvl>
+    <w:lvl w:ilvl="6" w:tplc="04090001" w:tentative="1">
+      <w:start w:val="1"/>
+      <w:numFmt w:val="bullet"/>
+      <w:lvlText w:val=""/>
+      <w:lvlJc w:val="left"/>
+      <w:pPr>
+        <w:ind w:left="5040" w:hanging="360"/>
+      </w:pPr>
+      <w:rPr>
+        <w:rFonts w:ascii="Symbol" w:hAnsi="Symbol" w:hint="default"/>
+      </w:rPr>
+    </w:lvl>
+    <w:lvl w:ilvl="7" w:tplc="04090003" w:tentative="1">
+      <w:start w:val="1"/>
+      <w:numFmt w:val="bullet"/>
+      <w:lvlText w:val="o"/>
+      <w:lvlJc w:val="left"/>
+      <w:pPr>
+        <w:ind w:left="5760" w:hanging="360"/>
+      </w:pPr>
+      <w:rPr>
+        <w:rFonts w:ascii="Courier New" w:hAnsi="Courier New" w:cs="Courier New" w:hint="default"/>
+      </w:rPr>
+    </w:lvl>
+    <w:lvl w:ilvl="8" w:tplc="04090005" w:tentative="1">
+      <w:start w:val="1"/>
+      <w:numFmt w:val="bullet"/>
+      <w:lvlText w:val=""/>
+      <w:lvlJc w:val="left"/>
+      <w:pPr>
+        <w:ind w:left="6480" w:hanging="360"/>
+      </w:pPr>
+      <w:rPr>
+        <w:rFonts w:ascii="Wingdings" w:hAnsi="Wingdings" w:hint="default"/>
+      </w:rPr>
+    </w:lvl>
+  </w:abstractNum>
+  <w:abstractNum w:abstractNumId="9" w15:restartNumberingAfterBreak="0">
+    <w:nsid w:val="530650ED"/>
+    <w:multiLevelType w:val="hybridMultilevel"/>
+    <w:tmpl w:val="C19E7A0A"/>
+    <w:lvl w:ilvl="0" w:tplc="0409000F">
+      <w:start w:val="1"/>
+      <w:numFmt w:val="decimal"/>
+      <w:lvlText w:val="%1."/>
+      <w:lvlJc w:val="left"/>
+      <w:pPr>
+        <w:ind w:left="720" w:hanging="360"/>
+      </w:pPr>
+    </w:lvl>
+    <w:lvl w:ilvl="1" w:tplc="04090019" w:tentative="1">
+      <w:start w:val="1"/>
+      <w:numFmt w:val="lowerLetter"/>
+      <w:lvlText w:val="%2."/>
+      <w:lvlJc w:val="left"/>
+      <w:pPr>
+        <w:ind w:left="1440" w:hanging="360"/>
+      </w:pPr>
+    </w:lvl>
+    <w:lvl w:ilvl="2" w:tplc="0409001B" w:tentative="1">
+      <w:start w:val="1"/>
+      <w:numFmt w:val="lowerRoman"/>
+      <w:lvlText w:val="%3."/>
+      <w:lvlJc w:val="right"/>
+      <w:pPr>
+        <w:ind w:left="2160" w:hanging="180"/>
+      </w:pPr>
+    </w:lvl>
+    <w:lvl w:ilvl="3" w:tplc="0409000F" w:tentative="1">
+      <w:start w:val="1"/>
+      <w:numFmt w:val="decimal"/>
+      <w:lvlText w:val="%4."/>
+      <w:lvlJc w:val="left"/>
+      <w:pPr>
+        <w:ind w:left="2880" w:hanging="360"/>
+      </w:pPr>
+    </w:lvl>
+    <w:lvl w:ilvl="4" w:tplc="04090019" w:tentative="1">
+      <w:start w:val="1"/>
+      <w:numFmt w:val="lowerLetter"/>
+      <w:lvlText w:val="%5."/>
+      <w:lvlJc w:val="left"/>
+      <w:pPr>
+        <w:ind w:left="3600" w:hanging="360"/>
+      </w:pPr>
+    </w:lvl>
+    <w:lvl w:ilvl="5" w:tplc="0409001B" w:tentative="1">
+      <w:start w:val="1"/>
+      <w:numFmt w:val="lowerRoman"/>
+      <w:lvlText w:val="%6."/>
+      <w:lvlJc w:val="right"/>
+      <w:pPr>
+        <w:ind w:left="4320" w:hanging="180"/>
+      </w:pPr>
+    </w:lvl>
+    <w:lvl w:ilvl="6" w:tplc="0409000F" w:tentative="1">
+      <w:start w:val="1"/>
+      <w:numFmt w:val="decimal"/>
+      <w:lvlText w:val="%7."/>
+      <w:lvlJc w:val="left"/>
+      <w:pPr>
+        <w:ind w:left="5040" w:hanging="360"/>
+      </w:pPr>
+    </w:lvl>
+    <w:lvl w:ilvl="7" w:tplc="04090019" w:tentative="1">
+      <w:start w:val="1"/>
+      <w:numFmt w:val="lowerLetter"/>
+      <w:lvlText w:val="%8."/>
+      <w:lvlJc w:val="left"/>
+      <w:pPr>
+        <w:ind w:left="5760" w:hanging="360"/>
+      </w:pPr>
+    </w:lvl>
+    <w:lvl w:ilvl="8" w:tplc="0409001B" w:tentative="1">
+      <w:start w:val="1"/>
+      <w:numFmt w:val="lowerRoman"/>
+      <w:lvlText w:val="%9."/>
+      <w:lvlJc w:val="right"/>
+      <w:pPr>
+        <w:ind w:left="6480" w:hanging="180"/>
+      </w:pPr>
+    </w:lvl>
+  </w:abstractNum>
+  <w:abstractNum w:abstractNumId="10" w15:restartNumberingAfterBreak="0">
+    <w:nsid w:val="594315BE"/>
+    <w:multiLevelType w:val="hybridMultilevel"/>
+    <w:tmpl w:val="899A6DDE"/>
+    <w:lvl w:ilvl="0" w:tplc="04090001">
+      <w:start w:val="1"/>
+      <w:numFmt w:val="bullet"/>
+      <w:lvlText w:val=""/>
+      <w:lvlJc w:val="left"/>
+      <w:pPr>
+        <w:ind w:left="720" w:hanging="360"/>
+      </w:pPr>
+      <w:rPr>
+        <w:rFonts w:ascii="Symbol" w:hAnsi="Symbol" w:hint="default"/>
+      </w:rPr>
+    </w:lvl>
+    <w:lvl w:ilvl="1" w:tplc="04090003" w:tentative="1">
+      <w:start w:val="1"/>
+      <w:numFmt w:val="bullet"/>
+      <w:lvlText w:val="o"/>
+      <w:lvlJc w:val="left"/>
+      <w:pPr>
+        <w:ind w:left="1440" w:hanging="360"/>
+      </w:pPr>
+      <w:rPr>
+        <w:rFonts w:ascii="Courier New" w:hAnsi="Courier New" w:cs="Courier New" w:hint="default"/>
+      </w:rPr>
+    </w:lvl>
+    <w:lvl w:ilvl="2" w:tplc="04090005" w:tentative="1">
+      <w:start w:val="1"/>
+      <w:numFmt w:val="bullet"/>
+      <w:lvlText w:val=""/>
+      <w:lvlJc w:val="left"/>
+      <w:pPr>
+        <w:ind w:left="2160" w:hanging="360"/>
+      </w:pPr>
+      <w:rPr>
+        <w:rFonts w:ascii="Wingdings" w:hAnsi="Wingdings" w:hint="default"/>
+      </w:rPr>
+    </w:lvl>
+    <w:lvl w:ilvl="3" w:tplc="04090001" w:tentative="1">
+      <w:start w:val="1"/>
+      <w:numFmt w:val="bullet"/>
+      <w:lvlText w:val=""/>
+      <w:lvlJc w:val="left"/>
+      <w:pPr>
+        <w:ind w:left="2880" w:hanging="360"/>
+      </w:pPr>
+      <w:rPr>
+        <w:rFonts w:ascii="Symbol" w:hAnsi="Symbol" w:hint="default"/>
+      </w:rPr>
+    </w:lvl>
+    <w:lvl w:ilvl="4" w:tplc="04090003" w:tentative="1">
+      <w:start w:val="1"/>
+      <w:numFmt w:val="bullet"/>
+      <w:lvlText w:val="o"/>
+      <w:lvlJc w:val="left"/>
+      <w:pPr>
+        <w:ind w:left="3600" w:hanging="360"/>
+      </w:pPr>
+      <w:rPr>
+        <w:rFonts w:ascii="Courier New" w:hAnsi="Courier New" w:cs="Courier New" w:hint="default"/>
+      </w:rPr>
+    </w:lvl>
+    <w:lvl w:ilvl="5" w:tplc="04090005" w:tentative="1">
+      <w:start w:val="1"/>
+      <w:numFmt w:val="bullet"/>
+      <w:lvlText w:val=""/>
+      <w:lvlJc w:val="left"/>
+      <w:pPr>
+        <w:ind w:left="4320" w:hanging="360"/>
+      </w:pPr>
+      <w:rPr>
+        <w:rFonts w:ascii="Wingdings" w:hAnsi="Wingdings" w:hint="default"/>
+      </w:rPr>
+    </w:lvl>
+    <w:lvl w:ilvl="6" w:tplc="04090001" w:tentative="1">
+      <w:start w:val="1"/>
+      <w:numFmt w:val="bullet"/>
+      <w:lvlText w:val=""/>
+      <w:lvlJc w:val="left"/>
+      <w:pPr>
+        <w:ind w:left="5040" w:hanging="360"/>
+      </w:pPr>
+      <w:rPr>
+        <w:rFonts w:ascii="Symbol" w:hAnsi="Symbol" w:hint="default"/>
+      </w:rPr>
+    </w:lvl>
+    <w:lvl w:ilvl="7" w:tplc="04090003" w:tentative="1">
+      <w:start w:val="1"/>
+      <w:numFmt w:val="bullet"/>
+      <w:lvlText w:val="o"/>
+      <w:lvlJc w:val="left"/>
+      <w:pPr>
+        <w:ind w:left="5760" w:hanging="360"/>
+      </w:pPr>
+      <w:rPr>
+        <w:rFonts w:ascii="Courier New" w:hAnsi="Courier New" w:cs="Courier New" w:hint="default"/>
+      </w:rPr>
+    </w:lvl>
+    <w:lvl w:ilvl="8" w:tplc="04090005" w:tentative="1">
+      <w:start w:val="1"/>
+      <w:numFmt w:val="bullet"/>
+      <w:lvlText w:val=""/>
+      <w:lvlJc w:val="left"/>
+      <w:pPr>
+        <w:ind w:left="6480" w:hanging="360"/>
+      </w:pPr>
+      <w:rPr>
+        <w:rFonts w:ascii="Wingdings" w:hAnsi="Wingdings" w:hint="default"/>
+      </w:rPr>
+    </w:lvl>
+  </w:abstractNum>
+  <w:abstractNum w:abstractNumId="11" w15:restartNumberingAfterBreak="0">
+    <w:nsid w:val="5ECF796D"/>
+    <w:multiLevelType w:val="hybridMultilevel"/>
+    <w:tmpl w:val="3DAE876A"/>
+    <w:lvl w:ilvl="0" w:tplc="04090001">
+      <w:start w:val="1"/>
+      <w:numFmt w:val="bullet"/>
+      <w:lvlText w:val=""/>
+      <w:lvlJc w:val="left"/>
+      <w:pPr>
+        <w:ind w:left="720" w:hanging="360"/>
+      </w:pPr>
+      <w:rPr>
+        <w:rFonts w:ascii="Symbol" w:hAnsi="Symbol" w:hint="default"/>
+      </w:rPr>
+    </w:lvl>
+    <w:lvl w:ilvl="1" w:tplc="04090003" w:tentative="1">
+      <w:start w:val="1"/>
+      <w:numFmt w:val="bullet"/>
+      <w:lvlText w:val="o"/>
+      <w:lvlJc w:val="left"/>
+      <w:pPr>
+        <w:ind w:left="1440" w:hanging="360"/>
+      </w:pPr>
+      <w:rPr>
+        <w:rFonts w:ascii="Courier New" w:hAnsi="Courier New" w:cs="Courier New" w:hint="default"/>
+      </w:rPr>
+    </w:lvl>
+    <w:lvl w:ilvl="2" w:tplc="04090005" w:tentative="1">
+      <w:start w:val="1"/>
+      <w:numFmt w:val="bullet"/>
+      <w:lvlText w:val=""/>
+      <w:lvlJc w:val="left"/>
+      <w:pPr>
+        <w:ind w:left="2160" w:hanging="360"/>
+      </w:pPr>
+      <w:rPr>
+        <w:rFonts w:ascii="Wingdings" w:hAnsi="Wingdings" w:hint="default"/>
+      </w:rPr>
+    </w:lvl>
+    <w:lvl w:ilvl="3" w:tplc="04090001" w:tentative="1">
+      <w:start w:val="1"/>
+      <w:numFmt w:val="bullet"/>
+      <w:lvlText w:val=""/>
+      <w:lvlJc w:val="left"/>
+      <w:pPr>
+        <w:ind w:left="2880" w:hanging="360"/>
+      </w:pPr>
+      <w:rPr>
+        <w:rFonts w:ascii="Symbol" w:hAnsi="Symbol" w:hint="default"/>
+      </w:rPr>
+    </w:lvl>
+    <w:lvl w:ilvl="4" w:tplc="04090003" w:tentative="1">
+      <w:start w:val="1"/>
+      <w:numFmt w:val="bullet"/>
+      <w:lvlText w:val="o"/>
+      <w:lvlJc w:val="left"/>
+      <w:pPr>
+        <w:ind w:left="3600" w:hanging="360"/>
+      </w:pPr>
+      <w:rPr>
+        <w:rFonts w:ascii="Courier New" w:hAnsi="Courier New" w:cs="Courier New" w:hint="default"/>
+      </w:rPr>
+    </w:lvl>
+    <w:lvl w:ilvl="5" w:tplc="04090005" w:tentative="1">
+      <w:start w:val="1"/>
+      <w:numFmt w:val="bullet"/>
+      <w:lvlText w:val=""/>
+      <w:lvlJc w:val="left"/>
+      <w:pPr>
+        <w:ind w:left="4320" w:hanging="360"/>
+      </w:pPr>
+      <w:rPr>
+        <w:rFonts w:ascii="Wingdings" w:hAnsi="Wingdings" w:hint="default"/>
+      </w:rPr>
+    </w:lvl>
+    <w:lvl w:ilvl="6" w:tplc="04090001" w:tentative="1">
+      <w:start w:val="1"/>
+      <w:numFmt w:val="bullet"/>
+      <w:lvlText w:val=""/>
+      <w:lvlJc w:val="left"/>
+      <w:pPr>
+        <w:ind w:left="5040" w:hanging="360"/>
+      </w:pPr>
+      <w:rPr>
+        <w:rFonts w:ascii="Symbol" w:hAnsi="Symbol" w:hint="default"/>
+      </w:rPr>
+    </w:lvl>
+    <w:lvl w:ilvl="7" w:tplc="04090003" w:tentative="1">
+      <w:start w:val="1"/>
+      <w:numFmt w:val="bullet"/>
+      <w:lvlText w:val="o"/>
+      <w:lvlJc w:val="left"/>
+      <w:pPr>
+        <w:ind w:left="5760" w:hanging="360"/>
+      </w:pPr>
+      <w:rPr>
+        <w:rFonts w:ascii="Courier New" w:hAnsi="Courier New" w:cs="Courier New" w:hint="default"/>
+      </w:rPr>
+    </w:lvl>
+    <w:lvl w:ilvl="8" w:tplc="04090005" w:tentative="1">
+      <w:start w:val="1"/>
+      <w:numFmt w:val="bullet"/>
+      <w:lvlText w:val=""/>
+      <w:lvlJc w:val="left"/>
+      <w:pPr>
+        <w:ind w:left="6480" w:hanging="360"/>
+      </w:pPr>
+      <w:rPr>
+        <w:rFonts w:ascii="Wingdings" w:hAnsi="Wingdings" w:hint="default"/>
+      </w:rPr>
+    </w:lvl>
+  </w:abstractNum>
+  <w:abstractNum w:abstractNumId="12" w15:restartNumberingAfterBreak="0">
+    <w:nsid w:val="6210480B"/>
+    <w:multiLevelType w:val="hybridMultilevel"/>
+    <w:tmpl w:val="40847402"/>
+    <w:lvl w:ilvl="0" w:tplc="04090001">
+      <w:start w:val="1"/>
+      <w:numFmt w:val="bullet"/>
+      <w:lvlText w:val=""/>
+      <w:lvlJc w:val="left"/>
+      <w:pPr>
+        <w:ind w:left="720" w:hanging="360"/>
+      </w:pPr>
+      <w:rPr>
+        <w:rFonts w:ascii="Symbol" w:hAnsi="Symbol" w:hint="default"/>
+      </w:rPr>
+    </w:lvl>
+    <w:lvl w:ilvl="1" w:tplc="FFFFFFFF" w:tentative="1">
+      <w:start w:val="1"/>
+      <w:numFmt w:val="lowerLetter"/>
+      <w:lvlText w:val="%2."/>
+      <w:lvlJc w:val="left"/>
+      <w:pPr>
+        <w:ind w:left="1440" w:hanging="360"/>
+      </w:pPr>
+    </w:lvl>
+    <w:lvl w:ilvl="2" w:tplc="FFFFFFFF" w:tentative="1">
+      <w:start w:val="1"/>
+      <w:numFmt w:val="lowerRoman"/>
+      <w:lvlText w:val="%3."/>
+      <w:lvlJc w:val="right"/>
+      <w:pPr>
+        <w:ind w:left="2160" w:hanging="180"/>
+      </w:pPr>
+    </w:lvl>
+    <w:lvl w:ilvl="3" w:tplc="FFFFFFFF" w:tentative="1">
+      <w:start w:val="1"/>
+      <w:numFmt w:val="decimal"/>
+      <w:lvlText w:val="%4."/>
+      <w:lvlJc w:val="left"/>
+      <w:pPr>
+        <w:ind w:left="2880" w:hanging="360"/>
+      </w:pPr>
+    </w:lvl>
+    <w:lvl w:ilvl="4" w:tplc="FFFFFFFF" w:tentative="1">
+      <w:start w:val="1"/>
+      <w:numFmt w:val="lowerLetter"/>
+      <w:lvlText w:val="%5."/>
+      <w:lvlJc w:val="left"/>
+      <w:pPr>
+        <w:ind w:left="3600" w:hanging="360"/>
+      </w:pPr>
+    </w:lvl>
+    <w:lvl w:ilvl="5" w:tplc="FFFFFFFF" w:tentative="1">
+      <w:start w:val="1"/>
+      <w:numFmt w:val="lowerRoman"/>
+      <w:lvlText w:val="%6."/>
+      <w:lvlJc w:val="right"/>
+      <w:pPr>
+        <w:ind w:left="4320" w:hanging="180"/>
+      </w:pPr>
+    </w:lvl>
+    <w:lvl w:ilvl="6" w:tplc="FFFFFFFF" w:tentative="1">
+      <w:start w:val="1"/>
+      <w:numFmt w:val="decimal"/>
+      <w:lvlText w:val="%7."/>
+      <w:lvlJc w:val="left"/>
+      <w:pPr>
+        <w:ind w:left="5040" w:hanging="360"/>
+      </w:pPr>
+    </w:lvl>
+    <w:lvl w:ilvl="7" w:tplc="FFFFFFFF" w:tentative="1">
+      <w:start w:val="1"/>
+      <w:numFmt w:val="lowerLetter"/>
+      <w:lvlText w:val="%8."/>
+      <w:lvlJc w:val="left"/>
+      <w:pPr>
+        <w:ind w:left="5760" w:hanging="360"/>
+      </w:pPr>
+    </w:lvl>
+    <w:lvl w:ilvl="8" w:tplc="FFFFFFFF" w:tentative="1">
+      <w:start w:val="1"/>
+      <w:numFmt w:val="lowerRoman"/>
+      <w:lvlText w:val="%9."/>
+      <w:lvlJc w:val="right"/>
+      <w:pPr>
+        <w:ind w:left="6480" w:hanging="180"/>
+      </w:pPr>
+    </w:lvl>
+  </w:abstractNum>
+  <w:abstractNum w:abstractNumId="13" w15:restartNumberingAfterBreak="0">
+    <w:nsid w:val="65345378"/>
+    <w:multiLevelType w:val="hybridMultilevel"/>
+    <w:tmpl w:val="E9F4D174"/>
+    <w:lvl w:ilvl="0" w:tplc="04090001">
+      <w:start w:val="1"/>
+      <w:numFmt w:val="bullet"/>
+      <w:lvlText w:val=""/>
+      <w:lvlJc w:val="left"/>
+      <w:pPr>
+        <w:ind w:left="720" w:hanging="360"/>
+      </w:pPr>
+      <w:rPr>
+        <w:rFonts w:ascii="Symbol" w:hAnsi="Symbol" w:hint="default"/>
+      </w:rPr>
+    </w:lvl>
+    <w:lvl w:ilvl="1" w:tplc="04090003" w:tentative="1">
+      <w:start w:val="1"/>
+      <w:numFmt w:val="bullet"/>
+      <w:lvlText w:val="o"/>
+      <w:lvlJc w:val="left"/>
+      <w:pPr>
+        <w:ind w:left="1440" w:hanging="360"/>
+      </w:pPr>
+      <w:rPr>
+        <w:rFonts w:ascii="Courier New" w:hAnsi="Courier New" w:cs="Courier New" w:hint="default"/>
+      </w:rPr>
+    </w:lvl>
+    <w:lvl w:ilvl="2" w:tplc="04090005" w:tentative="1">
+      <w:start w:val="1"/>
+      <w:numFmt w:val="bullet"/>
+      <w:lvlText w:val=""/>
+      <w:lvlJc w:val="left"/>
+      <w:pPr>
+        <w:ind w:left="2160" w:hanging="360"/>
+      </w:pPr>
+      <w:rPr>
+        <w:rFonts w:ascii="Wingdings" w:hAnsi="Wingdings" w:hint="default"/>
+      </w:rPr>
+    </w:lvl>
+    <w:lvl w:ilvl="3" w:tplc="04090001" w:tentative="1">
+      <w:start w:val="1"/>
+      <w:numFmt w:val="bullet"/>
+      <w:lvlText w:val=""/>
+      <w:lvlJc w:val="left"/>
+      <w:pPr>
+        <w:ind w:left="2880" w:hanging="360"/>
+      </w:pPr>
+      <w:rPr>
+        <w:rFonts w:ascii="Symbol" w:hAnsi="Symbol" w:hint="default"/>
+      </w:rPr>
+    </w:lvl>
+    <w:lvl w:ilvl="4" w:tplc="04090003" w:tentative="1">
+      <w:start w:val="1"/>
+      <w:numFmt w:val="bullet"/>
+      <w:lvlText w:val="o"/>
+      <w:lvlJc w:val="left"/>
+      <w:pPr>
+        <w:ind w:left="3600" w:hanging="360"/>
+      </w:pPr>
+      <w:rPr>
+        <w:rFonts w:ascii="Courier New" w:hAnsi="Courier New" w:cs="Courier New" w:hint="default"/>
+      </w:rPr>
+    </w:lvl>
+    <w:lvl w:ilvl="5" w:tplc="04090005" w:tentative="1">
+      <w:start w:val="1"/>
+      <w:numFmt w:val="bullet"/>
+      <w:lvlText w:val=""/>
+      <w:lvlJc w:val="left"/>
+      <w:pPr>
+        <w:ind w:left="4320" w:hanging="360"/>
+      </w:pPr>
+      <w:rPr>
+        <w:rFonts w:ascii="Wingdings" w:hAnsi="Wingdings" w:hint="default"/>
+      </w:rPr>
+    </w:lvl>
+    <w:lvl w:ilvl="6" w:tplc="04090001" w:tentative="1">
+      <w:start w:val="1"/>
+      <w:numFmt w:val="bullet"/>
+      <w:lvlText w:val=""/>
+      <w:lvlJc w:val="left"/>
+      <w:pPr>
+        <w:ind w:left="5040" w:hanging="360"/>
+      </w:pPr>
+      <w:rPr>
+        <w:rFonts w:ascii="Symbol" w:hAnsi="Symbol" w:hint="default"/>
+      </w:rPr>
+    </w:lvl>
+    <w:lvl w:ilvl="7" w:tplc="04090003" w:tentative="1">
+      <w:start w:val="1"/>
+      <w:numFmt w:val="bullet"/>
+      <w:lvlText w:val="o"/>
+      <w:lvlJc w:val="left"/>
+      <w:pPr>
+        <w:ind w:left="5760" w:hanging="360"/>
+      </w:pPr>
+      <w:rPr>
+        <w:rFonts w:ascii="Courier New" w:hAnsi="Courier New" w:cs="Courier New" w:hint="default"/>
+      </w:rPr>
+    </w:lvl>
+    <w:lvl w:ilvl="8" w:tplc="04090005" w:tentative="1">
+      <w:start w:val="1"/>
+      <w:numFmt w:val="bullet"/>
+      <w:lvlText w:val=""/>
+      <w:lvlJc w:val="left"/>
+      <w:pPr>
+        <w:ind w:left="6480" w:hanging="360"/>
+      </w:pPr>
+      <w:rPr>
+        <w:rFonts w:ascii="Wingdings" w:hAnsi="Wingdings" w:hint="default"/>
+      </w:rPr>
+    </w:lvl>
+  </w:abstractNum>
+  <w:abstractNum w:abstractNumId="14" w15:restartNumberingAfterBreak="0">
     <w:nsid w:val="69C75838"/>
     <w:multiLevelType w:val="multilevel"/>
     <w:tmpl w:val="3910912E"/>
@@ -1708,7 +3434,7 @@
       </w:rPr>
     </w:lvl>
   </w:abstractNum>
-  <w:abstractNum w:abstractNumId="4" w15:restartNumberingAfterBreak="0">
+  <w:abstractNum w:abstractNumId="15" w15:restartNumberingAfterBreak="0">
     <w:nsid w:val="79B73B27"/>
     <w:multiLevelType w:val="multilevel"/>
     <w:tmpl w:val="329866F4"/>
@@ -1858,19 +3584,52 @@
     </w:lvl>
   </w:abstractNum>
   <w:num w:numId="1" w16cid:durableId="1258516433">
-    <w:abstractNumId w:val="1"/>
+    <w:abstractNumId w:val="4"/>
   </w:num>
   <w:num w:numId="2" w16cid:durableId="336079687">
-    <w:abstractNumId w:val="3"/>
+    <w:abstractNumId w:val="14"/>
   </w:num>
   <w:num w:numId="3" w16cid:durableId="1899366029">
     <w:abstractNumId w:val="0"/>
   </w:num>
   <w:num w:numId="4" w16cid:durableId="53747464">
-    <w:abstractNumId w:val="4"/>
+    <w:abstractNumId w:val="15"/>
   </w:num>
   <w:num w:numId="5" w16cid:durableId="1262568163">
+    <w:abstractNumId w:val="5"/>
+  </w:num>
+  <w:num w:numId="6" w16cid:durableId="931622988">
+    <w:abstractNumId w:val="13"/>
+  </w:num>
+  <w:num w:numId="7" w16cid:durableId="1457990872">
+    <w:abstractNumId w:val="1"/>
+  </w:num>
+  <w:num w:numId="8" w16cid:durableId="589313826">
+    <w:abstractNumId w:val="8"/>
+  </w:num>
+  <w:num w:numId="9" w16cid:durableId="23866978">
+    <w:abstractNumId w:val="7"/>
+  </w:num>
+  <w:num w:numId="10" w16cid:durableId="1975016184">
+    <w:abstractNumId w:val="6"/>
+  </w:num>
+  <w:num w:numId="11" w16cid:durableId="1108769008">
+    <w:abstractNumId w:val="11"/>
+  </w:num>
+  <w:num w:numId="12" w16cid:durableId="134953981">
     <w:abstractNumId w:val="2"/>
+  </w:num>
+  <w:num w:numId="13" w16cid:durableId="1902403435">
+    <w:abstractNumId w:val="9"/>
+  </w:num>
+  <w:num w:numId="14" w16cid:durableId="374081973">
+    <w:abstractNumId w:val="12"/>
+  </w:num>
+  <w:num w:numId="15" w16cid:durableId="2003005359">
+    <w:abstractNumId w:val="10"/>
+  </w:num>
+  <w:num w:numId="16" w16cid:durableId="341855631">
+    <w:abstractNumId w:val="3"/>
   </w:num>
 </w:numbering>
 </file>

</xml_diff>